<commit_message>
Actualizar documento con las nuevas imágenes de diagramas C4 traducidos al español
</commit_message>
<xml_diff>
--- a/Documento/Documento_Habilidades_Blandas_actualizado_v2.docx
+++ b/Documento/Documento_Habilidades_Blandas_actualizado_v2.docx
@@ -1,6 +1,6 @@
 
 <file path=word/document.xml><?xml version="1.0" encoding="utf-8"?>
-<w:document xmlns:wpc="http://schemas.microsoft.com/office/word/2010/wordprocessingCanvas" xmlns:cx="http://schemas.microsoft.com/office/drawing/2014/chartex" xmlns:cx1="http://schemas.microsoft.com/office/drawing/2015/9/8/chartex" xmlns:cx2="http://schemas.microsoft.com/office/drawing/2015/10/21/chartex" xmlns:cx3="http://schemas.microsoft.com/office/drawing/2016/5/9/chartex" xmlns:cx4="http://schemas.microsoft.com/office/drawing/2016/5/10/chartex" xmlns:cx5="http://schemas.microsoft.com/office/drawing/2016/5/11/chartex" xmlns:cx6="http://schemas.microsoft.com/office/drawing/2016/5/12/chartex" xmlns:cx7="http://schemas.microsoft.com/office/drawing/2016/5/13/chartex" xmlns:cx8="http://schemas.microsoft.com/office/drawing/2016/5/14/chartex" xmlns:mc="http://schemas.openxmlformats.org/markup-compatibility/2006" xmlns:aink="http://schemas.microsoft.com/office/drawing/2016/ink" xmlns:am3d="http://schemas.microsoft.com/office/drawing/2017/model3d" xmlns:o="urn:schemas-microsoft-com:office:office" xmlns:oel="http://schemas.microsoft.com/office/2019/extlst" xmlns:r="http://schemas.openxmlformats.org/officeDocument/2006/relationships" xmlns:m="http://schemas.openxmlformats.org/officeDocument/2006/math" xmlns:v="urn:schemas-microsoft-com:vml" xmlns:wp14="http://schemas.microsoft.com/office/word/2010/wordprocessingDrawing" xmlns:wp="http://schemas.openxmlformats.org/drawingml/2006/wordprocessingDrawing" xmlns:w10="urn:schemas-microsoft-com:office:word" xmlns:w="http://schemas.openxmlformats.org/wordprocessingml/2006/main" xmlns:w14="http://schemas.microsoft.com/office/word/2010/wordml" xmlns:w15="http://schemas.microsoft.com/office/word/2012/wordml" xmlns:w16cex="http://schemas.microsoft.com/office/word/2018/wordml/cex" xmlns:w16cid="http://schemas.microsoft.com/office/word/2016/wordml/cid" xmlns:w16="http://schemas.microsoft.com/office/word/2018/wordml" xmlns:w16du="http://schemas.microsoft.com/office/word/2023/wordml/word16du" xmlns:w16sdtdh="http://schemas.microsoft.com/office/word/2020/wordml/sdtdatahash" xmlns:w16sdtfl="http://schemas.microsoft.com/office/word/2024/wordml/sdtformatlock" xmlns:w16se="http://schemas.microsoft.com/office/word/2015/wordml/symex" xmlns:wpg="http://schemas.microsoft.com/office/word/2010/wordprocessingGroup" xmlns:wpi="http://schemas.microsoft.com/office/word/2010/wordprocessingInk" xmlns:wne="http://schemas.microsoft.com/office/word/2006/wordml" xmlns:wps="http://schemas.microsoft.com/office/word/2010/wordprocessingShape" mc:Ignorable="w14 w15 w16se w16cid w16 w16cex w16sdtdh w16sdtfl w16du wp14">
+<w:document xmlns:wpc="http://schemas.microsoft.com/office/word/2010/wordprocessingCanvas" xmlns:cx="http://schemas.microsoft.com/office/drawing/2014/chartex" xmlns:cx1="http://schemas.microsoft.com/office/drawing/2015/9/8/chartex" xmlns:cx2="http://schemas.microsoft.com/office/drawing/2015/10/21/chartex" xmlns:cx3="http://schemas.microsoft.com/office/drawing/2016/5/9/chartex" xmlns:cx4="http://schemas.microsoft.com/office/drawing/2016/5/10/chartex" xmlns:cx5="http://schemas.microsoft.com/office/drawing/2016/5/11/chartex" xmlns:cx6="http://schemas.microsoft.com/office/drawing/2016/5/12/chartex" xmlns:cx7="http://schemas.microsoft.com/office/drawing/2016/5/13/chartex" xmlns:cx8="http://schemas.microsoft.com/office/drawing/2016/5/14/chartex" xmlns:mc="http://schemas.openxmlformats.org/markup-compatibility/2006" xmlns:aink="http://schemas.microsoft.com/office/drawing/2016/ink" xmlns:am3d="http://schemas.microsoft.com/office/drawing/2017/model3d" xmlns:o="urn:schemas-microsoft-com:office:office" xmlns:r="http://schemas.openxmlformats.org/officeDocument/2006/relationships" xmlns:m="http://schemas.openxmlformats.org/officeDocument/2006/math" xmlns:v="urn:schemas-microsoft-com:vml" xmlns:wp14="http://schemas.microsoft.com/office/word/2010/wordprocessingDrawing" xmlns:wp="http://schemas.openxmlformats.org/drawingml/2006/wordprocessingDrawing" xmlns:w10="urn:schemas-microsoft-com:office:word" xmlns:w="http://schemas.openxmlformats.org/wordprocessingml/2006/main" xmlns:w14="http://schemas.microsoft.com/office/word/2010/wordml" xmlns:w15="http://schemas.microsoft.com/office/word/2012/wordml" xmlns:w16cex="http://schemas.microsoft.com/office/word/2018/wordml/cex" xmlns:w16cid="http://schemas.microsoft.com/office/word/2016/wordml/cid" xmlns:w16="http://schemas.microsoft.com/office/word/2018/wordml" xmlns:w16se="http://schemas.microsoft.com/office/word/2015/wordml/symex" xmlns:wpg="http://schemas.microsoft.com/office/word/2010/wordprocessingGroup" xmlns:wpi="http://schemas.microsoft.com/office/word/2010/wordprocessingInk" xmlns:wne="http://schemas.microsoft.com/office/word/2006/wordml" xmlns:wps="http://schemas.microsoft.com/office/word/2010/wordprocessingShape" mc:Ignorable="w14 w15 w16se w16cid w16 w16cex wp14">
   <w:body>
     <w:p>
       <w:pPr>
@@ -292,7 +292,7 @@
                 <v:stroke joinstyle="miter"/>
                 <v:path gradientshapeok="t" o:connecttype="rect"/>
               </v:shapetype>
-              <v:shape id="Cuadro de texto 10" o:spid="_x0000_s1026" type="#_x0000_t202" style="position:absolute;left:0;text-align:left;margin-left:-6.45pt;margin-top:11.3pt;width:552pt;height:103.4pt;z-index:251662336;visibility:visible;mso-wrap-style:square;mso-width-percent:0;mso-height-percent:0;mso-wrap-distance-left:9pt;mso-wrap-distance-top:0;mso-wrap-distance-right:9pt;mso-wrap-distance-bottom:0;mso-position-horizontal:absolute;mso-position-horizontal-relative:margin;mso-position-vertical:absolute;mso-position-vertical-relative:text;mso-width-percent:0;mso-height-percent:0;mso-width-relative:margin;mso-height-relative:margin;v-text-anchor:top" o:gfxdata="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" fillcolor="window" stroked="f" strokeweight=".5pt">
+              <v:shape id="Cuadro de texto 10" o:spid="_x0000_s1026" type="#_x0000_t202" style="position:absolute;left:0;text-align:left;margin-left:-6.45pt;margin-top:11.3pt;width:552pt;height:103.4pt;z-index:251662336;visibility:visible;mso-wrap-style:square;mso-width-percent:0;mso-height-percent:0;mso-wrap-distance-left:9pt;mso-wrap-distance-top:0;mso-wrap-distance-right:9pt;mso-wrap-distance-bottom:0;mso-position-horizontal:absolute;mso-position-horizontal-relative:margin;mso-position-vertical:absolute;mso-position-vertical-relative:text;mso-width-percent:0;mso-height-percent:0;mso-width-relative:margin;mso-height-relative:margin;v-text-anchor:top" o:gfxdata="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" fillcolor="window" stroked="f" strokeweight=".5pt">
                 <v:textbox>
                   <w:txbxContent>
                     <w:p>
@@ -573,7 +573,7 @@
           </mc:Choice>
           <mc:Fallback>
             <w:pict>
-              <v:shape w14:anchorId="057C256B" id="Cuadro de texto 12" o:spid="_x0000_s1027" type="#_x0000_t202" style="position:absolute;left:0;text-align:left;margin-left:55.35pt;margin-top:.35pt;width:509.1pt;height:83.1pt;z-index:251663360;visibility:visible;mso-wrap-style:square;mso-width-percent:0;mso-height-percent:0;mso-wrap-distance-left:9pt;mso-wrap-distance-top:0;mso-wrap-distance-right:9pt;mso-wrap-distance-bottom:0;mso-position-horizontal:absolute;mso-position-horizontal-relative:page;mso-position-vertical:absolute;mso-position-vertical-relative:text;mso-width-percent:0;mso-height-percent:0;mso-width-relative:margin;mso-height-relative:margin;v-text-anchor:top" o:gfxdata="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" fillcolor="window" stroked="f" strokeweight=".5pt">
+              <v:shape w14:anchorId="057C256B" id="Cuadro de texto 12" o:spid="_x0000_s1027" type="#_x0000_t202" style="position:absolute;left:0;text-align:left;margin-left:55.35pt;margin-top:.35pt;width:509.1pt;height:83.1pt;z-index:251663360;visibility:visible;mso-wrap-style:square;mso-width-percent:0;mso-height-percent:0;mso-wrap-distance-left:9pt;mso-wrap-distance-top:0;mso-wrap-distance-right:9pt;mso-wrap-distance-bottom:0;mso-position-horizontal:absolute;mso-position-horizontal-relative:page;mso-position-vertical:absolute;mso-position-vertical-relative:text;mso-width-percent:0;mso-height-percent:0;mso-width-relative:margin;mso-height-relative:margin;v-text-anchor:top" o:gfxdata="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" fillcolor="window" stroked="f" strokeweight=".5pt">
                 <v:textbox>
                   <w:txbxContent>
                     <w:p>
@@ -1025,7 +1025,7 @@
           </mc:Choice>
           <mc:Fallback>
             <w:pict>
-              <v:shape w14:anchorId="7C488751" id="Cuadro de texto 14" o:spid="_x0000_s1028" type="#_x0000_t202" style="position:absolute;left:0;text-align:left;margin-left:180.65pt;margin-top:4.65pt;width:264pt;height:342.65pt;z-index:251664384;visibility:visible;mso-wrap-style:square;mso-width-percent:0;mso-height-percent:0;mso-wrap-distance-left:9pt;mso-wrap-distance-top:0;mso-wrap-distance-right:9pt;mso-wrap-distance-bottom:0;mso-position-horizontal:absolute;mso-position-horizontal-relative:page;mso-position-vertical:absolute;mso-position-vertical-relative:text;mso-width-percent:0;mso-height-percent:0;mso-width-relative:margin;mso-height-relative:margin;v-text-anchor:top" o:gfxdata="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" fillcolor="window" stroked="f" strokeweight=".5pt">
+              <v:shape w14:anchorId="7C488751" id="Cuadro de texto 14" o:spid="_x0000_s1028" type="#_x0000_t202" style="position:absolute;left:0;text-align:left;margin-left:180.65pt;margin-top:4.65pt;width:264pt;height:342.65pt;z-index:251664384;visibility:visible;mso-wrap-style:square;mso-width-percent:0;mso-height-percent:0;mso-wrap-distance-left:9pt;mso-wrap-distance-top:0;mso-wrap-distance-right:9pt;mso-wrap-distance-bottom:0;mso-position-horizontal:absolute;mso-position-horizontal-relative:page;mso-position-vertical:absolute;mso-position-vertical-relative:text;mso-width-percent:0;mso-height-percent:0;mso-width-relative:margin;mso-height-relative:margin;v-text-anchor:top" o:gfxdata="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" fillcolor="window" stroked="f" strokeweight=".5pt">
                 <v:textbox>
                   <w:txbxContent>
                     <w:p>
@@ -7663,7 +7663,7 @@
           </mc:Choice>
           <mc:Fallback>
             <w:pict>
-              <v:shape w14:anchorId="57A4ED0E" id="Cuadro de texto 8" o:spid="_x0000_s1029" type="#_x0000_t202" style="position:absolute;left:0;text-align:left;margin-left:7.85pt;margin-top:66.25pt;width:508.65pt;height:35.3pt;z-index:251659264;visibility:visible;mso-wrap-style:square;mso-height-percent:0;mso-wrap-distance-left:9pt;mso-wrap-distance-top:0;mso-wrap-distance-right:9pt;mso-wrap-distance-bottom:0;mso-position-horizontal:absolute;mso-position-horizontal-relative:text;mso-position-vertical:absolute;mso-position-vertical-relative:text;mso-height-percent:0;mso-height-relative:margin;v-text-anchor:top" o:gfxdata="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" fillcolor="white [3201]" stroked="f" strokeweight=".5pt">
+              <v:shape w14:anchorId="57A4ED0E" id="Cuadro de texto 8" o:spid="_x0000_s1029" type="#_x0000_t202" style="position:absolute;left:0;text-align:left;margin-left:7.85pt;margin-top:66.25pt;width:508.65pt;height:35.3pt;z-index:251659264;visibility:visible;mso-wrap-style:square;mso-height-percent:0;mso-wrap-distance-left:9pt;mso-wrap-distance-top:0;mso-wrap-distance-right:9pt;mso-wrap-distance-bottom:0;mso-position-horizontal:absolute;mso-position-horizontal-relative:text;mso-position-vertical:absolute;mso-position-vertical-relative:text;mso-height-percent:0;mso-height-relative:margin;v-text-anchor:top" o:gfxdata="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" fillcolor="white [3201]" stroked="f" strokeweight=".5pt">
                 <v:textbox>
                   <w:txbxContent>
                     <w:p>
@@ -7835,7 +7835,7 @@
           </mc:Choice>
           <mc:Fallback>
             <w:pict>
-              <v:shape w14:anchorId="7172CE2E" id="Frame1" o:spid="_x0000_s1030" type="#_x0000_t202" style="position:absolute;left:0;text-align:left;margin-left:1in;margin-top:10.9pt;width:468pt;height:55.3pt;z-index:251656704;visibility:visible;mso-wrap-style:square;mso-height-percent:0;mso-wrap-distance-left:9.35pt;mso-wrap-distance-top:9.35pt;mso-wrap-distance-right:9.35pt;mso-wrap-distance-bottom:9.35pt;mso-position-horizontal:absolute;mso-position-horizontal-relative:page;mso-position-vertical:absolute;mso-position-vertical-relative:text;mso-height-percent:0;mso-height-relative:margin;v-text-anchor:top" o:gfxdata="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" o:allowincell="f" stroked="f">
+              <v:shape w14:anchorId="7172CE2E" id="Frame1" o:spid="_x0000_s1030" type="#_x0000_t202" style="position:absolute;left:0;text-align:left;margin-left:1in;margin-top:10.9pt;width:468pt;height:55.3pt;z-index:251656704;visibility:visible;mso-wrap-style:square;mso-height-percent:0;mso-wrap-distance-left:9.35pt;mso-wrap-distance-top:9.35pt;mso-wrap-distance-right:9.35pt;mso-wrap-distance-bottom:9.35pt;mso-position-horizontal:absolute;mso-position-horizontal-relative:page;mso-position-vertical:absolute;mso-position-vertical-relative:text;mso-height-percent:0;mso-height-relative:margin;v-text-anchor:top" o:gfxdata="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" o:allowincell="f" stroked="f">
                 <v:fill opacity="0"/>
                 <v:textbox inset="0,0,0,0">
                   <w:txbxContent>
@@ -8034,7 +8034,10 @@
         <w:pStyle w:val="Text"/>
       </w:pPr>
       <w:r>
-        <w:t xml:space="preserve">Las empresas receptoras de estudiantes en prácticas y los empleadores de graduados declararon que, pese a la educación técnico-profesional recibida por los alumnos, hay ciertas carencias relacionadas con habilidades transversales indispensables para el ejercicio profesional. Entre las principales limitaciones se destacan la comunicación verbal y </w:t>
+        <w:t>Las empresas receptoras de estudiantes en prácticas y los empleadores de graduados declararon que, pese a la educación técnico-p</w:t>
+      </w:r>
+      <w:r>
+        <w:t xml:space="preserve">rofesional recibida por los alumnos, hay ciertas carencias relacionadas con habilidades transversales indispensables para el ejercicio profesional. Entre las principales limitaciones se destacan la comunicación verbal y </w:t>
       </w:r>
     </w:p>
     <w:p>
@@ -8047,7 +8050,16 @@
         <w:pStyle w:val="Text"/>
       </w:pPr>
       <w:r>
-        <w:t xml:space="preserve">escrita, el trato colegiado, el enfrentamiento a conflictos, el liderazgo, la gestión de tareas, la comunicación eficaz de ideas e inteligencia emocional. En esta situación participan estudiantes, docentes, tutoras, coordinadoras de carrera, colaboradoras empresariales, graduados y miembros del departamento de servicios al estudiante. Ello es tal, además, que cada actor utiliza criterios distinta para evaluar las habilidades, y los docentes disponen de poco tiempo para seguir las clases de manera activa. La carrera necesitará instalar un Sistema Integral de Formación de Competencias Transversales que </w:t>
+        <w:t>escrita, el trato colegiado, el en</w:t>
+      </w:r>
+      <w:r>
+        <w:t>frentamiento a conflictos, el liderazgo, la gestión de tareas, la comunicación eficaz de ideas e inteligencia emocional. En esta situación participan estudiantes, docentes, tutoras, coordinadoras de carrera, colaboradoras empresariales, graduados y miembro</w:t>
+      </w:r>
+      <w:r>
+        <w:t>s del departamento de servicios al estudiante. Ello es tal, además, que cada actor utiliza criterios distinta para evaluar las habilidades, y los docentes disponen de poco tiempo para seguir las clases de manera activa. La carrera necesitará instalar un Si</w:t>
+      </w:r>
+      <w:r>
+        <w:t xml:space="preserve">stema Integral de Formación de Competencias Transversales que </w:t>
       </w:r>
     </w:p>
     <w:p>
@@ -8060,7 +8072,10 @@
         <w:pStyle w:val="Text"/>
       </w:pPr>
       <w:r>
-        <w:t>realice análisis previos, ofrezca evaluaciones de pares y docentes y evaluaciones de empleadores, gestione actividades formativas y tareas colaborativas, administre ejemplos de desarrollo de la competencia y genere análisis de la enseñanza que facilite la supervisión del individuo y de grupo de alumnos.</w:t>
+        <w:t xml:space="preserve">realice análisis previos, ofrezca evaluaciones de pares y docentes y evaluaciones de empleadores, gestione actividades formativas y tareas colaborativas, administre ejemplos de </w:t>
+      </w:r>
+      <w:r>
+        <w:t>desarrollo de la competencia y genere análisis de la enseñanza que facilite la supervisión del individuo y de grupo de alumnos.</w:t>
       </w:r>
     </w:p>
     <w:p>
@@ -8119,7 +8134,10 @@
         </w:numPr>
       </w:pPr>
       <w:r>
-        <w:t>Crear un sistema web para el diagnóstico, la capacitación y el seguimiento continuo de habilidades blandas en la comunidad estudiantil.</w:t>
+        <w:t>Crear un sistema web para el diagnóstico, la capacitación y el seguimiento con</w:t>
+      </w:r>
+      <w:r>
+        <w:t>tinuo de habilidades blandas en la comunidad estudiantil.</w:t>
       </w:r>
     </w:p>
     <w:p>
@@ -8172,7 +8190,10 @@
         <w:jc w:val="both"/>
       </w:pPr>
       <w:r>
-        <w:t>Ejecutar esquemas de evaluación 360° integrando las visiones de docentes, pares, empleadores y el propio estudiante.</w:t>
+        <w:t>Ejecutar esquemas de evaluación 360° integrando las visiones de docentes,</w:t>
+      </w:r>
+      <w:r>
+        <w:t xml:space="preserve"> pares, empleadores y el propio estudiante.</w:t>
       </w:r>
     </w:p>
     <w:p>
@@ -8208,7 +8229,10 @@
         <w:jc w:val="both"/>
       </w:pPr>
       <w:r>
-        <w:t>Proporcionar métricas claras e indicadores de aprendizaje mediante paneles interactivos para facilitar la toma de decisiones.</w:t>
+        <w:t>Proporcion</w:t>
+      </w:r>
+      <w:r>
+        <w:t>ar métricas claras e indicadores de aprendizaje mediante paneles interactivos para facilitar la toma de decisiones.</w:t>
       </w:r>
     </w:p>
     <w:p>
@@ -8253,7 +8277,10 @@
         <w:pStyle w:val="TableTitle"/>
       </w:pPr>
       <w:r>
-        <w:t>TABLA I</w:t>
+        <w:t>T</w:t>
+      </w:r>
+      <w:r>
+        <w:t>ABLA I</w:t>
       </w:r>
     </w:p>
     <w:p>
@@ -8427,7 +8454,10 @@
           </w:tcPr>
           <w:p>
             <w:r>
-              <w:t>Evalúa a estudiantes, diseña y asigna actividades formativas, revisa evidencias.</w:t>
+              <w:t xml:space="preserve">Evalúa a estudiantes, diseña y asigna </w:t>
+            </w:r>
+            <w:r>
+              <w:t>actividades formativas, revisa evidencias.</w:t>
             </w:r>
           </w:p>
         </w:tc>
@@ -8517,7 +8547,10 @@
               <w:ind w:firstLine="0"/>
             </w:pPr>
             <w:r>
-              <w:t>Administra el sistema, gestiona usuarios, genera reportes globales, define competencias y criterios.</w:t>
+              <w:t xml:space="preserve">Administra el sistema, gestiona usuarios, genera reportes </w:t>
+            </w:r>
+            <w:r>
+              <w:t>globales, define competencias y criterios.</w:t>
             </w:r>
           </w:p>
         </w:tc>
@@ -8603,7 +8636,10 @@
           </w:tcPr>
           <w:p>
             <w:r>
-              <w:t>Mantiene vínculo con la carrera, puede actuar como mentor o evaluador en actividades.</w:t>
+              <w:t>Mantiene vínculo con la carrera, puede actuar como mentor o evaluador en actividades</w:t>
+            </w:r>
+            <w:r>
+              <w:t>.</w:t>
             </w:r>
           </w:p>
         </w:tc>
@@ -8689,7 +8725,10 @@
           </w:tcPr>
           <w:p>
             <w:r>
-              <w:t>Gestiona usuarios y roles, configura parámetros generales de la plataforma, da soporte técnico y controla accesos. </w:t>
+              <w:t xml:space="preserve">Gestiona usuarios y roles, configura parámetros generales de la plataforma, da soporte técnico y controla </w:t>
+            </w:r>
+            <w:r>
+              <w:t>accesos. </w:t>
             </w:r>
           </w:p>
         </w:tc>
@@ -8781,7 +8820,10 @@
         </w:numPr>
       </w:pPr>
       <w:r>
-        <w:t>Módulo de evaluaciones (autoevaluación, evaluación por pares, docentes, empleadores).</w:t>
+        <w:t>Módulo de evaluaciones (autoevaluación, ev</w:t>
+      </w:r>
+      <w:r>
+        <w:t>aluación por pares, docentes, empleadores).</w:t>
       </w:r>
     </w:p>
     <w:p>
@@ -8901,7 +8943,10 @@
         </w:numPr>
       </w:pPr>
       <w:r>
-        <w:t>Módulo de reclutamiento o bolsa de trabajo.</w:t>
+        <w:t>Módulo de reclutamiento o bolsa de trabajo</w:t>
+      </w:r>
+      <w:r>
+        <w:t>.</w:t>
       </w:r>
     </w:p>
     <w:p>
@@ -8961,7 +9006,10 @@
         </w:numPr>
       </w:pPr>
       <w:r>
-        <w:t>El sistema debe estar disponible en horario académico (7:00 a 22:00) con alta disponibilidad.</w:t>
+        <w:t xml:space="preserve">El sistema debe estar disponible en horario académico </w:t>
+      </w:r>
+      <w:r>
+        <w:t>(7:00 a 22:00) con alta disponibilidad.</w:t>
       </w:r>
     </w:p>
     <w:p>
@@ -9026,7 +9074,10 @@
       </w:r>
       <w:proofErr w:type="spellEnd"/>
       <w:r>
-        <w:t xml:space="preserve"> para autenticación inicial (o se usará registro con correo institucional).</w:t>
+        <w:t xml:space="preserve"> para autenticación inicial (o se usará registro con correo</w:t>
+      </w:r>
+      <w:r>
+        <w:t xml:space="preserve"> institucional).</w:t>
       </w:r>
     </w:p>
     <w:p>
@@ -9062,7 +9113,10 @@
         </w:numPr>
       </w:pPr>
       <w:r>
-        <w:t>Se contará con un equipo de soporte técnico para mantenimiento.</w:t>
+        <w:t>Se contará con un equipo de soporte técni</w:t>
+      </w:r>
+      <w:r>
+        <w:t>co para mantenimiento.</w:t>
       </w:r>
     </w:p>
     <w:p>
@@ -9253,7 +9307,10 @@
           </w:tcPr>
           <w:p>
             <w:r>
-              <w:t>El sistema debe permitir el registro de usuarios con los roles: Estudiante, Docente, Tutor Académico, Coordinador de Carrera, Empresa Colaboradora y Graduado.</w:t>
+              <w:t xml:space="preserve">El sistema debe permitir el registro de usuarios con los roles: Estudiante, Docente, Tutor Académico, Coordinador de Carrera, Empresa </w:t>
+            </w:r>
+            <w:r>
+              <w:t>Colaboradora y Graduado.</w:t>
             </w:r>
           </w:p>
         </w:tc>
@@ -9355,7 +9412,10 @@
           </w:tcPr>
           <w:p>
             <w:r>
-              <w:t>El sistema debe permitir a los estudiantes completar un diagnóstico inicial de habilidades blandas mediante un cuestionario estructurado al momento de su ingreso a la carrera.</w:t>
+              <w:t xml:space="preserve">El sistema debe permitir a los </w:t>
+            </w:r>
+            <w:r>
+              <w:t>estudiantes completar un diagnóstico inicial de habilidades blandas mediante un cuestionario estructurado al momento de su ingreso a la carrera.</w:t>
             </w:r>
           </w:p>
         </w:tc>
@@ -9406,7 +9466,10 @@
           </w:tcPr>
           <w:p>
             <w:r>
-              <w:t>El sistema debe permitir a los estudiantes visualizar su perfil de competencias, mostrando los niveles alcanzados en cada habilidad blanda evaluada.</w:t>
+              <w:t>El sistema debe permitir a los estudiantes visualizar su perfil de competencias, mostrando los niveles al</w:t>
+            </w:r>
+            <w:r>
+              <w:t>canzados en cada habilidad blanda evaluada.</w:t>
             </w:r>
           </w:p>
         </w:tc>
@@ -9508,7 +9571,10 @@
           </w:tcPr>
           <w:p>
             <w:r>
-              <w:t>El sistema debe permitir a los estudiantes inscribirse en las actividades formativas disponibles según su nivel y requisitos.</w:t>
+              <w:t>El sistema debe permitir a l</w:t>
+            </w:r>
+            <w:r>
+              <w:t>os estudiantes inscribirse en las actividades formativas disponibles según su nivel y requisitos.</w:t>
             </w:r>
           </w:p>
         </w:tc>
@@ -9610,7 +9676,10 @@
           </w:tcPr>
           <w:p>
             <w:r>
-              <w:t>El sistema debe permitir a los docentes revisar, validar o rechazar las evidencias subidas por los estudiantes, con registro de retroalimentación.</w:t>
+              <w:t xml:space="preserve">El </w:t>
+            </w:r>
+            <w:r>
+              <w:t>sistema debe permitir a los docentes revisar, validar o rechazar las evidencias subidas por los estudiantes, con registro de retroalimentación.</w:t>
             </w:r>
           </w:p>
         </w:tc>
@@ -9662,7 +9731,10 @@
           </w:tcPr>
           <w:p>
             <w:r>
-              <w:t>El sistema debe permitir a los estudiantes realizar evaluaciones entre pares dentro de un mismo equipo o proyecto colaborativo.</w:t>
+              <w:t>El sistema debe permitir a los estudiantes realizar evaluaciones entre pares dentro de un mismo equipo o p</w:t>
+            </w:r>
+            <w:r>
+              <w:t>royecto colaborativo.</w:t>
             </w:r>
           </w:p>
         </w:tc>
@@ -9764,7 +9836,10 @@
           </w:tcPr>
           <w:p>
             <w:r>
-              <w:t>El sistema debe permitir a las empresas colaboradoras evaluar las habilidades blandas de los estudiantes durante sus prácticas preprofesionales.</w:t>
+              <w:t xml:space="preserve">El sistema debe permitir a las empresas colaboradoras evaluar las habilidades </w:t>
+            </w:r>
+            <w:r>
+              <w:t>blandas de los estudiantes durante sus prácticas preprofesionales.</w:t>
             </w:r>
           </w:p>
         </w:tc>
@@ -9866,7 +9941,10 @@
           </w:tcPr>
           <w:p>
             <w:r>
-              <w:t>El sistema debe permitir a los tutores académicos visualizar el progreso de sus estudiantes tutorados en todas las competencias evaluadas.</w:t>
+              <w:t>El sistema debe permitir a los tutores ac</w:t>
+            </w:r>
+            <w:r>
+              <w:t>adémicos visualizar el progreso de sus estudiantes tutorados en todas las competencias evaluadas.</w:t>
             </w:r>
           </w:p>
         </w:tc>
@@ -9968,7 +10046,10 @@
           </w:tcPr>
           <w:p>
             <w:r>
-              <w:t xml:space="preserve">El sistema debe permitir al coordinador de carrera configurar las competencias a evaluar, sus </w:t>
+              <w:t>El sis</w:t>
+            </w:r>
+            <w:r>
+              <w:t xml:space="preserve">tema debe permitir al coordinador de carrera configurar las competencias a evaluar, sus </w:t>
             </w:r>
             <w:proofErr w:type="spellStart"/>
             <w:r>
@@ -10027,7 +10108,10 @@
           </w:tcPr>
           <w:p>
             <w:r>
-              <w:t>El sistema debe generar reportes de seguimiento individual por estudiante, mostrando su evolución en cada competencia a lo largo del tiempo.</w:t>
+              <w:t xml:space="preserve">El sistema debe generar reportes de seguimiento individual por estudiante, mostrando su evolución en cada competencia a </w:t>
+            </w:r>
+            <w:r>
+              <w:t>lo largo del tiempo.</w:t>
             </w:r>
           </w:p>
         </w:tc>
@@ -10129,7 +10213,10 @@
           </w:tcPr>
           <w:p>
             <w:r>
-              <w:t>El sistema debe mostrar un panel analítico con visualizaciones (gráficos, tendencias) que faciliten el seguimiento del desarrollo competencial.</w:t>
+              <w:t xml:space="preserve">El sistema debe mostrar un panel analítico con visualizaciones </w:t>
+            </w:r>
+            <w:r>
+              <w:t>(gráficos, tendencias) que faciliten el seguimiento del desarrollo competencial.</w:t>
             </w:r>
           </w:p>
         </w:tc>
@@ -10231,7 +10318,10 @@
           </w:tcPr>
           <w:p>
             <w:r>
-              <w:t>El sistema debe enviar notificaciones a los estudiantes sobre evaluaciones pendientes, nuevas actividades disponibles y resultados obtenidos.</w:t>
+              <w:t xml:space="preserve">El sistema </w:t>
+            </w:r>
+            <w:r>
+              <w:t>debe enviar notificaciones a los estudiantes sobre evaluaciones pendientes, nuevas actividades disponibles y resultados obtenidos.</w:t>
             </w:r>
           </w:p>
         </w:tc>
@@ -10384,7 +10474,10 @@
           </w:tcPr>
           <w:p>
             <w:r>
-              <w:t>El sistema debe permitir al administrador del sistema gestionar cuentas de usuario, asignar y modificar roles según el perfil institucional, configurar parámetros generales de la plataforma (correo, notificaciones, límites de archivos) y brindar soporte técnico a los demás actores. </w:t>
+              <w:t xml:space="preserve">El sistema debe permitir al administrador del sistema gestionar cuentas de usuario, asignar y </w:t>
+            </w:r>
+            <w:r>
+              <w:t>modificar roles según el perfil institucional, configurar parámetros generales de la plataforma (correo, notificaciones, límites de archivos) y brindar soporte técnico a los demás actores. </w:t>
             </w:r>
           </w:p>
         </w:tc>
@@ -10424,7 +10517,10 @@
         <w:pStyle w:val="TableTitle"/>
       </w:pPr>
       <w:r>
-        <w:t>requisitos No Funcionales</w:t>
+        <w:t xml:space="preserve">requisitos No </w:t>
+      </w:r>
+      <w:r>
+        <w:t>Funcionales</w:t>
       </w:r>
     </w:p>
     <w:tbl>
@@ -10597,7 +10693,10 @@
           </w:tcPr>
           <w:p>
             <w:r>
-              <w:t>Seguridad: Los datos personales de estudiantes, docentes y empleadores deben ser almacenados de forma cifrada para proteger la privacidad de los usuarios.</w:t>
+              <w:t>Seguridad: Los datos person</w:t>
+            </w:r>
+            <w:r>
+              <w:t>ales de estudiantes, docentes y empleadores deben ser almacenados de forma cifrada para proteger la privacidad de los usuarios.</w:t>
             </w:r>
           </w:p>
         </w:tc>
@@ -10646,7 +10745,10 @@
           </w:tcPr>
           <w:p>
             <w:r>
-              <w:t>Disponibilidad: El sistema debe garantizar un tiempo de actividad mínimo del 99% durante el horario académico (7:00 a 22:00), con tiempos de inactividad programados solo para mantenimiento.</w:t>
+              <w:t xml:space="preserve">Disponibilidad: El sistema debe garantizar un tiempo de actividad mínimo del 99% durante el horario académico (7:00 a </w:t>
+            </w:r>
+            <w:r>
+              <w:t>22:00), con tiempos de inactividad programados solo para mantenimiento.</w:t>
             </w:r>
           </w:p>
         </w:tc>
@@ -10695,7 +10797,10 @@
           </w:tcPr>
           <w:p>
             <w:r>
-              <w:t xml:space="preserve">El sistema debe responder en máximo 1 segundo para consultas simples, 2 segundos para consultas complejas con múltiples JOIN, y 3 segundos para generación de reportes PDF/Excel, apoyado en comunicación </w:t>
+              <w:t>El sistema debe responder en máximo 1 segundo para consultas simples, 2 segundos para consultas complejas con múltiples JOIN, y 3 segundos para generación de reportes PDF/Excel,</w:t>
+            </w:r>
+            <w:r>
+              <w:t xml:space="preserve"> apoyado en comunicación </w:t>
             </w:r>
             <w:proofErr w:type="spellStart"/>
             <w:r>
@@ -10752,7 +10857,10 @@
           </w:tcPr>
           <w:p>
             <w:r>
-              <w:t>Rendimiento: El sistema debe soportar al menos 600 estudiantes, 30 docentes y 20 empresas colaboradoras de manera concurrente sin degradación significativa del rendimiento.</w:t>
+              <w:t>Rendimiento: El sistema debe soportar al menos 600 estudiantes, 30 docentes y 20 empresas colaboradoras de manera concurrente sin degradación significati</w:t>
+            </w:r>
+            <w:r>
+              <w:t>va del rendimiento.</w:t>
             </w:r>
           </w:p>
         </w:tc>
@@ -10850,7 +10958,10 @@
           </w:tcPr>
           <w:p>
             <w:r>
-              <w:t>Escalabilidad: La arquitectura del sistema debe permitir escalar horizontalmente para soportar el crecimiento de la población estudiantil y la incorporación de nuevas funcionalidades.</w:t>
+              <w:t xml:space="preserve">Escalabilidad: La </w:t>
+            </w:r>
+            <w:r>
+              <w:t>arquitectura del sistema debe permitir escalar horizontalmente para soportar el crecimiento de la población estudiantil y la incorporación de nuevas funcionalidades.</w:t>
             </w:r>
           </w:p>
           <w:p>
@@ -10912,7 +11023,10 @@
           </w:tcPr>
           <w:p>
             <w:r>
-              <w:t>Mantenibilidad: El código del sistema debe estar organizado en módulos independientes y contar con documentación técnica que facilite las actualizaciones y correcciones.</w:t>
+              <w:t xml:space="preserve">Mantenibilidad: El código del sistema debe estar organizado en </w:t>
+            </w:r>
+            <w:r>
+              <w:t>módulos independientes y contar con documentación técnica que facilite las actualizaciones y correcciones.</w:t>
             </w:r>
           </w:p>
         </w:tc>
@@ -10961,7 +11075,10 @@
           </w:tcPr>
           <w:p>
             <w:r>
-              <w:t>Portabilidad: El sistema debe ser accesible desde los navegadores web más utilizados (Chrome, Firefox, Edge, Safari) en sus versiones recientes.</w:t>
+              <w:t>Portabilidad: El sistema debe ser accesible desde los navegadores web más utilizados (Chrome, Firefox, Edge, Safari) en sus versiones reciente</w:t>
+            </w:r>
+            <w:r>
+              <w:t>s.</w:t>
             </w:r>
           </w:p>
         </w:tc>
@@ -11060,7 +11177,10 @@
           </w:tcPr>
           <w:p>
             <w:r>
-              <w:t>Integridad: Una vez registrada una evaluación, esta no podrá ser modificada ni eliminada, garantizando la trazabilidad y confiabilidad de los datos.</w:t>
+              <w:t xml:space="preserve">Integridad: Una vez registrada una evaluación, esta no </w:t>
+            </w:r>
+            <w:r>
+              <w:t>podrá ser modificada ni eliminada, garantizando la trazabilidad y confiabilidad de los datos.</w:t>
             </w:r>
           </w:p>
         </w:tc>
@@ -11158,7 +11278,10 @@
           </w:tcPr>
           <w:p>
             <w:r>
-              <w:t>Privacidad: La información de las evaluaciones y el progreso de los estudiantes debe ser accesible únicamente para los roles autorizados, cumpliendo con la normativa de protección de datos personales.</w:t>
+              <w:t>Privacidad: La info</w:t>
+            </w:r>
+            <w:r>
+              <w:t>rmación de las evaluaciones y el progreso de los estudiantes debe ser accesible únicamente para los roles autorizados, cumpliendo con la normativa de protección de datos personales.</w:t>
             </w:r>
           </w:p>
         </w:tc>
@@ -11207,7 +11330,10 @@
           </w:tcPr>
           <w:p>
             <w:r>
-              <w:t>Confiabilidad: El sistema debe manejar los errores de forma controlada, mostrando mensajes claros al usuario sin exponer información técnica interna.</w:t>
+              <w:t xml:space="preserve">Confiabilidad: El sistema debe manejar los errores de forma </w:t>
+            </w:r>
+            <w:r>
+              <w:t>controlada, mostrando mensajes claros al usuario sin exponer información técnica interna.</w:t>
             </w:r>
           </w:p>
         </w:tc>
@@ -11272,7 +11398,10 @@
             </w:r>
             <w:proofErr w:type="spellEnd"/>
             <w:r>
-              <w:t xml:space="preserve"> y registro centralizado de logs de aplicación, permitiendo detectar de forma temprana caídas o degradación del servicio. </w:t>
+              <w:t xml:space="preserve"> y registro centralizado de logs de aplicación, permitiendo detectar de forma temprana caída</w:t>
+            </w:r>
+            <w:r>
+              <w:t>s o degradación del servicio. </w:t>
             </w:r>
           </w:p>
           <w:p/>
@@ -11482,7 +11611,10 @@
           </w:tcPr>
           <w:p>
             <w:r>
-              <w:t>Registrar nuevos usuarios asignándoles un rol específico (Estudiante, Docente, Tutor, Empresa o Graduado).</w:t>
+              <w:t xml:space="preserve">Registrar nuevos usuarios asignándoles un rol específico </w:t>
+            </w:r>
+            <w:r>
+              <w:t>(Estudiante, Docente, Tutor, Empresa o Graduado).</w:t>
             </w:r>
           </w:p>
         </w:tc>
@@ -11569,7 +11701,10 @@
           </w:tcPr>
           <w:p>
             <w:r>
-              <w:t>• El sistema valida que el correo tenga el dominio institucional.</w:t>
+              <w:t>• El sistema valida que el correo tenga el dominio institucion</w:t>
+            </w:r>
+            <w:r>
+              <w:t>al.</w:t>
             </w:r>
           </w:p>
           <w:p>
@@ -11687,7 +11822,14 @@
                 <w:b/>
                 <w:bCs/>
               </w:rPr>
-              <w:t>Inicio de sesión y autenticación</w:t>
+              <w:t xml:space="preserve">Inicio de sesión y </w:t>
+            </w:r>
+            <w:r>
+              <w:rPr>
+                <w:b/>
+                <w:bCs/>
+              </w:rPr>
+              <w:t>autenticación</w:t>
             </w:r>
           </w:p>
         </w:tc>
@@ -11868,7 +12010,10 @@
           </w:tcPr>
           <w:p>
             <w:r>
-              <w:t>• El sistema autentica mediante JWT.</w:t>
+              <w:t xml:space="preserve">• El sistema </w:t>
+            </w:r>
+            <w:r>
+              <w:t>autentica mediante JWT.</w:t>
             </w:r>
           </w:p>
           <w:p>
@@ -12120,7 +12265,10 @@
           </w:tcPr>
           <w:p>
             <w:r>
-              <w:t>Establecer una línea base de mis competencias y que el sistema pueda recomendar actividades de mejora.</w:t>
+              <w:t xml:space="preserve">Establecer una línea base de mis competencias y que el sistema pueda </w:t>
+            </w:r>
+            <w:r>
+              <w:t>recomendar actividades de mejora.</w:t>
             </w:r>
           </w:p>
         </w:tc>
@@ -12170,7 +12318,10 @@
           </w:p>
           <w:p>
             <w:r>
-              <w:t>• Al finalizar, el sistema genera un resultado por competencia.</w:t>
+              <w:t xml:space="preserve">• Al finalizar, el sistema genera un resultado por </w:t>
+            </w:r>
+            <w:r>
+              <w:t>competencia.</w:t>
             </w:r>
           </w:p>
           <w:p>
@@ -12392,7 +12543,10 @@
           </w:tcPr>
           <w:p>
             <w:r>
-              <w:t>Visualizar mi perfil completo de competencias con los niveles alcanzados en cada habilidad blanda.</w:t>
+              <w:t xml:space="preserve">Visualizar mi perfil completo de competencias con los niveles </w:t>
+            </w:r>
+            <w:r>
+              <w:t>alcanzados en cada habilidad blanda.</w:t>
             </w:r>
           </w:p>
         </w:tc>
@@ -12484,7 +12638,10 @@
           </w:p>
           <w:p>
             <w:r>
-              <w:t>• Se distingue visualmente entre competencias fuertes y débiles.</w:t>
+              <w:t>• Se distingue visualmente</w:t>
+            </w:r>
+            <w:r>
+              <w:t xml:space="preserve"> entre competencias fuertes y débiles.</w:t>
             </w:r>
           </w:p>
           <w:p>
@@ -12684,7 +12841,10 @@
           </w:tcPr>
           <w:p>
             <w:r>
-              <w:t>Crear, editar y eliminar actividades formativas (talleres, cursos, seminarios y dinámicas).</w:t>
+              <w:t xml:space="preserve">Crear, editar y eliminar actividades </w:t>
+            </w:r>
+            <w:r>
+              <w:t>formativas (talleres, cursos, seminarios y dinámicas).</w:t>
             </w:r>
           </w:p>
         </w:tc>
@@ -12771,7 +12931,10 @@
           </w:tcPr>
           <w:p>
             <w:r>
-              <w:t>• El docente define título, descripción, competencia asociada y fecha límite.</w:t>
+              <w:t>• El docente define título, descripción, competencia asociada y fecha lími</w:t>
+            </w:r>
+            <w:r>
+              <w:t>te.</w:t>
             </w:r>
           </w:p>
           <w:p>
@@ -13032,7 +13195,10 @@
           </w:tcPr>
           <w:p>
             <w:r>
-              <w:t>Participar en experiencias de aprendizaje que contribuyan a mi desarrollo competencial.</w:t>
+              <w:t xml:space="preserve">Participar en experiencias de aprendizaje que contribuyan a mi desarrollo </w:t>
+            </w:r>
+            <w:r>
+              <w:t>competencial.</w:t>
             </w:r>
           </w:p>
         </w:tc>
@@ -13087,7 +13253,10 @@
           </w:p>
           <w:p>
             <w:r>
-              <w:t>• El sistema confirma la inscripción de forma inmediata.</w:t>
+              <w:t>• El sistema confirma la inscripc</w:t>
+            </w:r>
+            <w:r>
+              <w:t>ión de forma inmediata.</w:t>
             </w:r>
           </w:p>
         </w:tc>
@@ -13323,7 +13492,10 @@
           </w:tcPr>
           <w:p>
             <w:r>
-              <w:t>Construir un portafolio de evidencias que respalde mi progreso y sea evaluado por los docentes.</w:t>
+              <w:t xml:space="preserve">Construir un </w:t>
+            </w:r>
+            <w:r>
+              <w:t>portafolio de evidencias que respalde mi progreso y sea evaluado por los docentes.</w:t>
             </w:r>
           </w:p>
         </w:tc>
@@ -13568,7 +13740,10 @@
           </w:tcPr>
           <w:p>
             <w:r>
-              <w:t>Revisar, validar o rechazar las evidencias subidas por los estudiantes, dejando retroalimentación escrita.</w:t>
+              <w:t xml:space="preserve">Revisar, </w:t>
+            </w:r>
+            <w:r>
+              <w:t>validar o rechazar las evidencias subidas por los estudiantes, dejando retroalimentación escrita.</w:t>
             </w:r>
           </w:p>
         </w:tc>
@@ -13655,7 +13830,10 @@
           </w:tcPr>
           <w:p>
             <w:r>
-              <w:t>• El docente accede a una bandeja de evidencias pendientes filtradas por actividad.</w:t>
+              <w:t>• El docente accede a un</w:t>
+            </w:r>
+            <w:r>
+              <w:t>a bandeja de evidencias pendientes filtradas por actividad.</w:t>
             </w:r>
           </w:p>
           <w:p>
@@ -13670,7 +13848,10 @@
           </w:p>
           <w:p>
             <w:r>
-              <w:t>• La evaluación queda registrada en el historial auditable del estudiante.</w:t>
+              <w:t>• La e</w:t>
+            </w:r>
+            <w:r>
+              <w:t>valuación queda registrada en el historial auditable del estudiante.</w:t>
             </w:r>
           </w:p>
         </w:tc>
@@ -13870,7 +14051,10 @@
           </w:tcPr>
           <w:p>
             <w:r>
-              <w:t>Evaluar a mis compañeros de equipo o proyecto colaborativo según una rúbrica definida.</w:t>
+              <w:t xml:space="preserve">Evaluar a mis compañeros de equipo o proyecto colaborativo según una rúbrica </w:t>
+            </w:r>
+            <w:r>
+              <w:t>definida.</w:t>
             </w:r>
           </w:p>
         </w:tc>
@@ -13962,7 +14146,10 @@
           </w:p>
           <w:p>
             <w:r>
-              <w:t>• La evaluación sigue los mismos criterios definidos por el coordinador.</w:t>
+              <w:t>• La evaluación sig</w:t>
+            </w:r>
+            <w:r>
+              <w:t>ue los mismos criterios definidos por el coordinador.</w:t>
             </w:r>
           </w:p>
           <w:p>
@@ -14067,7 +14254,14 @@
                 <w:b/>
                 <w:bCs/>
               </w:rPr>
-              <w:t>Registrar evaluaciones de estudiantes</w:t>
+              <w:t xml:space="preserve">Registrar </w:t>
+            </w:r>
+            <w:r>
+              <w:rPr>
+                <w:b/>
+                <w:bCs/>
+              </w:rPr>
+              <w:t>evaluaciones de estudiantes</w:t>
             </w:r>
           </w:p>
         </w:tc>
@@ -14208,7 +14402,10 @@
           </w:tcPr>
           <w:p>
             <w:r>
-              <w:t>Calificar objetivamente el desempeño competencial y generar insumos para los reportes académicos.</w:t>
+              <w:t xml:space="preserve">Calificar objetivamente el desempeño competencial y generar insumos para los reportes </w:t>
+            </w:r>
+            <w:r>
+              <w:t>académicos.</w:t>
             </w:r>
           </w:p>
         </w:tc>
@@ -14263,7 +14460,10 @@
           </w:p>
           <w:p>
             <w:r>
-              <w:t>• Una vez enviada, la evaluación no puede modificarse sin autorización del coordinador.</w:t>
+              <w:t>• Una vez envi</w:t>
+            </w:r>
+            <w:r>
+              <w:t>ada, la evaluación no puede modificarse sin autorización del coordinador.</w:t>
             </w:r>
           </w:p>
         </w:tc>
@@ -14452,7 +14652,10 @@
           </w:tcPr>
           <w:p>
             <w:r>
-              <w:t>Evaluar las habilidades blandas de los estudiantes que realizan prácticas preprofesionales en mi organización.</w:t>
+              <w:t xml:space="preserve">Evaluar las habilidades blandas de los estudiantes que </w:t>
+            </w:r>
+            <w:r>
+              <w:t>realizan prácticas preprofesionales en mi organización.</w:t>
             </w:r>
           </w:p>
         </w:tc>
@@ -14539,7 +14742,10 @@
           </w:tcPr>
           <w:p>
             <w:r>
-              <w:t>• El empleador accede solo a los estudiantes que tiene asignados.</w:t>
+              <w:t xml:space="preserve">• El empleador accede solo a los estudiantes que tiene </w:t>
+            </w:r>
+            <w:r>
+              <w:t>asignados.</w:t>
             </w:r>
           </w:p>
           <w:p>
@@ -14588,7 +14794,10 @@
         <w:pStyle w:val="TableTitle"/>
       </w:pPr>
       <w:r>
-        <w:t>HISTORIA DE USUARIO – HU12</w:t>
+        <w:t xml:space="preserve">HISTORIA DE </w:t>
+      </w:r>
+      <w:r>
+        <w:t>USUARIO – HU12</w:t>
       </w:r>
     </w:p>
     <w:tbl>
@@ -14800,7 +15009,10 @@
           </w:tcPr>
           <w:p>
             <w:r>
-              <w:t>Aportar información valiosa para mejorar el currículo y la formación de los estudiantes actuales.</w:t>
+              <w:t xml:space="preserve">Aportar información valiosa para mejorar el currículo y la </w:t>
+            </w:r>
+            <w:r>
+              <w:t>formación de los estudiantes actuales.</w:t>
             </w:r>
           </w:p>
         </w:tc>
@@ -14850,7 +15062,10 @@
           </w:p>
           <w:p>
             <w:r>
-              <w:t xml:space="preserve">• El graduado puede dejar retroalimentación a los estudiantes que </w:t>
+              <w:t>• El graduado puede d</w:t>
+            </w:r>
+            <w:r>
+              <w:t xml:space="preserve">ejar retroalimentación a los estudiantes que </w:t>
             </w:r>
             <w:proofErr w:type="spellStart"/>
             <w:r>
@@ -15048,7 +15263,10 @@
           </w:tcPr>
           <w:p>
             <w:r>
-              <w:t>Visualizar el progreso detallado en todas las competencias de los estudiantes que tengo asignados como tutor.</w:t>
+              <w:t xml:space="preserve">Visualizar el progreso detallado en todas las competencias de los </w:t>
+            </w:r>
+            <w:r>
+              <w:t>estudiantes que tengo asignados como tutor.</w:t>
             </w:r>
           </w:p>
         </w:tc>
@@ -15140,7 +15358,10 @@
           </w:p>
           <w:p>
             <w:r>
-              <w:t>• Puede entrar al detalle de cada estudiante (evaluaciones, evidencias, actividades).</w:t>
+              <w:t>• Puede e</w:t>
+            </w:r>
+            <w:r>
+              <w:t>ntrar al detalle de cada estudiante (evaluaciones, evidencias, actividades).</w:t>
             </w:r>
           </w:p>
           <w:p>
@@ -15174,7 +15395,10 @@
         <w:pStyle w:val="TableTitle"/>
       </w:pPr>
       <w:r>
-        <w:t>HISTORIA DE USUARIO – HU14</w:t>
+        <w:t xml:space="preserve">HISTORIA DE USUARIO – </w:t>
+      </w:r>
+      <w:r>
+        <w:t>HU14</w:t>
       </w:r>
     </w:p>
     <w:tbl>
@@ -15387,7 +15611,10 @@
           </w:tcPr>
           <w:p>
             <w:r>
-              <w:t>Fomentar el trabajo en equipo y la aplicación práctica de habilidades blandas en contextos desafiantes.</w:t>
+              <w:t xml:space="preserve">Fomentar el trabajo en equipo y la aplicación práctica de </w:t>
+            </w:r>
+            <w:r>
+              <w:t>habilidades blandas en contextos desafiantes.</w:t>
             </w:r>
           </w:p>
         </w:tc>
@@ -15437,7 +15664,10 @@
           </w:p>
           <w:p>
             <w:r>
-              <w:t>• El sistema registra los resultados individuales y de equipo al concluir el reto.</w:t>
+              <w:t>• El sistema registra los resultados ind</w:t>
+            </w:r>
+            <w:r>
+              <w:t>ividuales y de equipo al concluir el reto.</w:t>
             </w:r>
           </w:p>
         </w:tc>
@@ -15740,7 +15970,10 @@
             </w:r>
             <w:proofErr w:type="spellStart"/>
             <w:r>
-              <w:t>subcompetencias</w:t>
+              <w:t>sub</w:t>
+            </w:r>
+            <w:r>
+              <w:t>competencias</w:t>
             </w:r>
             <w:proofErr w:type="spellEnd"/>
             <w:r>
@@ -15990,7 +16223,10 @@
           </w:tcPr>
           <w:p>
             <w:r>
-              <w:t>Evaluar el progreso académico y personal de forma objetiva y fundamentada en datos.</w:t>
+              <w:t xml:space="preserve">Evaluar el progreso académico y personal de forma objetiva y </w:t>
+            </w:r>
+            <w:r>
+              <w:t>fundamentada en datos.</w:t>
             </w:r>
           </w:p>
         </w:tc>
@@ -16040,7 +16276,10 @@
           </w:p>
           <w:p>
             <w:r>
-              <w:t>• Consolida autoevaluaciones, evaluaciones docentes y de tutores.</w:t>
+              <w:t>• Consolida autoevaluaciones, evaluaciones docentes y de tutor</w:t>
+            </w:r>
+            <w:r>
+              <w:t>es.</w:t>
             </w:r>
           </w:p>
         </w:tc>
@@ -16276,7 +16515,10 @@
           </w:tcPr>
           <w:p>
             <w:r>
-              <w:t>Analizar tendencias globales, identificar brechas grupales y planificar mejoras curriculares.</w:t>
+              <w:t xml:space="preserve">Analizar </w:t>
+            </w:r>
+            <w:r>
+              <w:t>tendencias globales, identificar brechas grupales y planificar mejoras curriculares.</w:t>
             </w:r>
           </w:p>
         </w:tc>
@@ -16326,7 +16568,10 @@
           </w:p>
           <w:p>
             <w:r>
-              <w:t>• El reporte puede exportarse.</w:t>
+              <w:t xml:space="preserve">• El </w:t>
+            </w:r>
+            <w:r>
+              <w:t>reporte puede exportarse.</w:t>
             </w:r>
           </w:p>
           <w:p>
@@ -16536,7 +16781,10 @@
           </w:tcPr>
           <w:p>
             <w:r>
-              <w:t>Visualizar un panel analítico con gráficos y tendencias sobre el desarrollo de habilidades blandas.</w:t>
+              <w:t xml:space="preserve">Visualizar un panel analítico con </w:t>
+            </w:r>
+            <w:r>
+              <w:t>gráficos y tendencias sobre el desarrollo de habilidades blandas.</w:t>
             </w:r>
           </w:p>
         </w:tc>
@@ -16631,7 +16879,10 @@
             </w:r>
             <w:proofErr w:type="spellEnd"/>
             <w:r>
-              <w:t xml:space="preserve"> del estudiante muestra su progreso y actividades pendientes.</w:t>
+              <w:t xml:space="preserve"> del estudiante muestra su progreso y actividades pe</w:t>
+            </w:r>
+            <w:r>
+              <w:t>ndientes.</w:t>
             </w:r>
           </w:p>
           <w:p>
@@ -16686,7 +16937,10 @@
         <w:pStyle w:val="TableTitle"/>
       </w:pPr>
       <w:r>
-        <w:t>HISTORIA DE USUARIO – HU19</w:t>
+        <w:t>HISTORIA DE USUARIO – HU</w:t>
+      </w:r>
+      <w:r>
+        <w:t>19</w:t>
       </w:r>
     </w:p>
     <w:tbl>
@@ -16899,7 +17153,10 @@
           </w:tcPr>
           <w:p>
             <w:r>
-              <w:t>Garantizar la trazabilidad, transparencia y confiabilidad de los procesos evaluativos.</w:t>
+              <w:t xml:space="preserve">Garantizar la </w:t>
+            </w:r>
+            <w:r>
+              <w:t>trazabilidad, transparencia y confiabilidad de los procesos evaluativos.</w:t>
             </w:r>
           </w:p>
         </w:tc>
@@ -17147,7 +17404,10 @@
           </w:tcPr>
           <w:p>
             <w:r>
-              <w:t>Recibir notificaciones sobre evaluaciones pendientes, nuevas actividades disponibles y resultados obtenidos.</w:t>
+              <w:t xml:space="preserve">Recibir notificaciones sobre evaluaciones pendientes, nuevas </w:t>
+            </w:r>
+            <w:r>
+              <w:t>actividades disponibles y resultados obtenidos.</w:t>
             </w:r>
           </w:p>
         </w:tc>
@@ -17234,7 +17494,10 @@
           </w:tcPr>
           <w:p>
             <w:r>
-              <w:t>• Se notifica al menos: nueva actividad asignada, evaluación recibida, evidencia calificada.</w:t>
+              <w:t>• Se notifica al menos: nueva actividad asignada, evaluación recibida, evidencia califi</w:t>
+            </w:r>
+            <w:r>
+              <w:t>cada.</w:t>
             </w:r>
           </w:p>
           <w:p>
@@ -17401,7 +17664,10 @@
           </w:tcPr>
           <w:p>
             <w:r>
-              <w:t>Todos los actores con permisos</w:t>
+              <w:t xml:space="preserve">Todos los actores con </w:t>
+            </w:r>
+            <w:r>
+              <w:t>permisos</w:t>
             </w:r>
           </w:p>
         </w:tc>
@@ -17535,7 +17801,10 @@
           </w:tcPr>
           <w:p>
             <w:r>
-              <w:t>• El sistema permite exportar cualquier reporte generado.</w:t>
+              <w:t>• El sistema permite expor</w:t>
+            </w:r>
+            <w:r>
+              <w:t>tar cualquier reporte generado.</w:t>
             </w:r>
           </w:p>
           <w:p>
@@ -17640,7 +17909,14 @@
                 <w:b/>
                 <w:bCs/>
               </w:rPr>
-              <w:t>Acceder a información consolidada de estudiantes</w:t>
+              <w:t xml:space="preserve">Acceder a información consolidada de </w:t>
+            </w:r>
+            <w:r>
+              <w:rPr>
+                <w:b/>
+                <w:bCs/>
+              </w:rPr>
+              <w:t>estudiantes</w:t>
             </w:r>
           </w:p>
         </w:tc>
@@ -17781,7 +18057,10 @@
           </w:tcPr>
           <w:p>
             <w:r>
-              <w:t>Identificar tendencias y necesidades de apoyo psicoeducativo a nivel poblacional, respetando la privacidad individual.</w:t>
+              <w:t xml:space="preserve">Identificar tendencias y necesidades de apoyo psicoeducativo a nivel </w:t>
+            </w:r>
+            <w:r>
+              <w:t>poblacional, respetando la privacidad individual.</w:t>
             </w:r>
           </w:p>
         </w:tc>
@@ -17831,7 +18110,10 @@
           </w:p>
           <w:p>
             <w:r>
-              <w:t>• La información sensible de estos casos tiene acceso restringido a otros roles.</w:t>
+              <w:t xml:space="preserve">• La </w:t>
+            </w:r>
+            <w:r>
+              <w:t>información sensible de estos casos tiene acceso restringido a otros roles.</w:t>
             </w:r>
           </w:p>
         </w:tc>
@@ -18036,7 +18318,10 @@
           </w:tcPr>
           <w:p>
             <w:r>
-              <w:t>Gestionar cuentas de usuario, asignar roles y configurar parámetros generales de la plataforma.</w:t>
+              <w:t xml:space="preserve">Gestionar cuentas de usuario, asignar roles y </w:t>
+            </w:r>
+            <w:r>
+              <w:t>configurar parámetros generales de la plataforma.</w:t>
             </w:r>
           </w:p>
         </w:tc>
@@ -18128,7 +18413,10 @@
           </w:p>
           <w:p>
             <w:r>
-              <w:t>• El sistema permite asignar o modificar el rol institucional de cualquier usuario.</w:t>
+              <w:t>•</w:t>
+            </w:r>
+            <w:r>
+              <w:t xml:space="preserve"> El sistema permite asignar o modificar el rol institucional de cualquier usuario.</w:t>
             </w:r>
           </w:p>
           <w:p>
@@ -18138,7 +18426,10 @@
           </w:p>
           <w:p>
             <w:r>
-              <w:t>• El sistema registra en bitácora todas las acciones administrativas realizadas.</w:t>
+              <w:t xml:space="preserve">• El sistema registra en bitácora todas las acciones </w:t>
+            </w:r>
+            <w:r>
+              <w:t>administrativas realizadas.</w:t>
             </w:r>
           </w:p>
           <w:p>
@@ -18192,31 +18483,79 @@
       </w:r>
       <w:proofErr w:type="spellEnd"/>
       <w:r>
-        <w:t xml:space="preserve"> Backlog consolida las 23 historias de usuario levantadas para el sistema, priorizadas mediante la técnica MoSCoW (Must Have, </w:t>
+        <w:t xml:space="preserve"> Backlog consolida las 23 historias de usuario levantadas para el sistema, priorizadas mediante la técnica </w:t>
       </w:r>
       <w:proofErr w:type="spellStart"/>
       <w:r>
+        <w:t>MoSCoW</w:t>
+      </w:r>
+      <w:proofErr w:type="spellEnd"/>
+      <w:r>
+        <w:t xml:space="preserve"> (</w:t>
+      </w:r>
+      <w:proofErr w:type="spellStart"/>
+      <w:r>
+        <w:t>Must</w:t>
+      </w:r>
+      <w:proofErr w:type="spellEnd"/>
+      <w:r>
+        <w:t xml:space="preserve"> </w:t>
+      </w:r>
+      <w:proofErr w:type="spellStart"/>
+      <w:r>
+        <w:t>Have</w:t>
+      </w:r>
+      <w:proofErr w:type="spellEnd"/>
+      <w:r>
+        <w:t xml:space="preserve">, </w:t>
+      </w:r>
+      <w:proofErr w:type="spellStart"/>
+      <w:r>
         <w:t>Should</w:t>
       </w:r>
       <w:proofErr w:type="spellEnd"/>
       <w:r>
-        <w:t xml:space="preserve"> Have, </w:t>
+        <w:t xml:space="preserve"> </w:t>
       </w:r>
       <w:proofErr w:type="spellStart"/>
       <w:r>
+        <w:t>Have</w:t>
+      </w:r>
+      <w:proofErr w:type="spellEnd"/>
+      <w:r>
+        <w:t xml:space="preserve">, </w:t>
+      </w:r>
+      <w:proofErr w:type="spellStart"/>
+      <w:r>
         <w:t>Could</w:t>
       </w:r>
       <w:proofErr w:type="spellEnd"/>
       <w:r>
-        <w:t xml:space="preserve"> Have, </w:t>
+        <w:t xml:space="preserve"> </w:t>
       </w:r>
       <w:proofErr w:type="spellStart"/>
       <w:r>
+        <w:t>Have</w:t>
+      </w:r>
+      <w:proofErr w:type="spellEnd"/>
+      <w:r>
+        <w:t xml:space="preserve">, </w:t>
+      </w:r>
+      <w:proofErr w:type="spellStart"/>
+      <w:r>
         <w:t>Won't</w:t>
       </w:r>
       <w:proofErr w:type="spellEnd"/>
       <w:r>
-        <w:t xml:space="preserve"> Have). Esta priorización permite al equipo Scrum planificar los </w:t>
+        <w:t xml:space="preserve"> </w:t>
+      </w:r>
+      <w:proofErr w:type="spellStart"/>
+      <w:r>
+        <w:t>Have</w:t>
+      </w:r>
+      <w:proofErr w:type="spellEnd"/>
+      <w:r>
+        <w:t xml:space="preserve">). Esta priorización permite al equipo Scrum planificar los </w:t>
       </w:r>
       <w:proofErr w:type="spellStart"/>
       <w:r>
@@ -18379,7 +18718,10 @@
           </w:tcPr>
           <w:p>
             <w:r>
-              <w:t>Inicio de sesión y autenticación</w:t>
+              <w:t xml:space="preserve">Inicio de sesión y </w:t>
+            </w:r>
+            <w:r>
+              <w:t>autenticación</w:t>
             </w:r>
           </w:p>
         </w:tc>
@@ -18540,7 +18882,10 @@
           </w:tcPr>
           <w:p>
             <w:r>
-              <w:t>Subir evidencias de desarrollo</w:t>
+              <w:t xml:space="preserve">Subir </w:t>
+            </w:r>
+            <w:r>
+              <w:t>evidencias de desarrollo</w:t>
             </w:r>
           </w:p>
         </w:tc>
@@ -18779,8 +19124,13 @@
             </w:r>
             <w:proofErr w:type="spellEnd"/>
             <w:r>
-              <w:t xml:space="preserve"> Have</w:t>
-            </w:r>
+              <w:t xml:space="preserve"> </w:t>
+            </w:r>
+            <w:proofErr w:type="spellStart"/>
+            <w:r>
+              <w:t>Have</w:t>
+            </w:r>
+            <w:proofErr w:type="spellEnd"/>
           </w:p>
         </w:tc>
       </w:tr>
@@ -18816,8 +19166,13 @@
             </w:r>
             <w:proofErr w:type="spellEnd"/>
             <w:r>
-              <w:t xml:space="preserve"> Have</w:t>
-            </w:r>
+              <w:t xml:space="preserve"> </w:t>
+            </w:r>
+            <w:proofErr w:type="spellStart"/>
+            <w:r>
+              <w:t>Have</w:t>
+            </w:r>
+            <w:proofErr w:type="spellEnd"/>
           </w:p>
         </w:tc>
       </w:tr>
@@ -18853,8 +19208,13 @@
             </w:r>
             <w:proofErr w:type="spellEnd"/>
             <w:r>
-              <w:t xml:space="preserve"> Have</w:t>
-            </w:r>
+              <w:t xml:space="preserve"> </w:t>
+            </w:r>
+            <w:proofErr w:type="spellStart"/>
+            <w:r>
+              <w:t>Have</w:t>
+            </w:r>
+            <w:proofErr w:type="spellEnd"/>
           </w:p>
         </w:tc>
       </w:tr>
@@ -18890,8 +19250,13 @@
             </w:r>
             <w:proofErr w:type="spellEnd"/>
             <w:r>
-              <w:t xml:space="preserve"> Have</w:t>
-            </w:r>
+              <w:t xml:space="preserve"> </w:t>
+            </w:r>
+            <w:proofErr w:type="spellStart"/>
+            <w:r>
+              <w:t>Have</w:t>
+            </w:r>
+            <w:proofErr w:type="spellEnd"/>
           </w:p>
         </w:tc>
       </w:tr>
@@ -18927,8 +19292,13 @@
             </w:r>
             <w:proofErr w:type="spellEnd"/>
             <w:r>
-              <w:t xml:space="preserve"> Have</w:t>
-            </w:r>
+              <w:t xml:space="preserve"> </w:t>
+            </w:r>
+            <w:proofErr w:type="spellStart"/>
+            <w:r>
+              <w:t>Have</w:t>
+            </w:r>
+            <w:proofErr w:type="spellEnd"/>
           </w:p>
         </w:tc>
       </w:tr>
@@ -18964,8 +19334,13 @@
             </w:r>
             <w:proofErr w:type="spellEnd"/>
             <w:r>
-              <w:t xml:space="preserve"> Have</w:t>
-            </w:r>
+              <w:t xml:space="preserve"> </w:t>
+            </w:r>
+            <w:proofErr w:type="spellStart"/>
+            <w:r>
+              <w:t>Have</w:t>
+            </w:r>
+            <w:proofErr w:type="spellEnd"/>
           </w:p>
         </w:tc>
       </w:tr>
@@ -19001,8 +19376,13 @@
             </w:r>
             <w:proofErr w:type="spellEnd"/>
             <w:r>
-              <w:t xml:space="preserve"> Have</w:t>
-            </w:r>
+              <w:t xml:space="preserve"> </w:t>
+            </w:r>
+            <w:proofErr w:type="spellStart"/>
+            <w:r>
+              <w:t>Have</w:t>
+            </w:r>
+            <w:proofErr w:type="spellEnd"/>
           </w:p>
         </w:tc>
       </w:tr>
@@ -19023,7 +19403,10 @@
           </w:tcPr>
           <w:p>
             <w:r>
-              <w:t>Registrar retroalimentación como graduado</w:t>
+              <w:t xml:space="preserve">Registrar </w:t>
+            </w:r>
+            <w:r>
+              <w:t>retroalimentación como graduado</w:t>
             </w:r>
           </w:p>
         </w:tc>
@@ -19038,8 +19421,13 @@
             </w:r>
             <w:proofErr w:type="spellEnd"/>
             <w:r>
-              <w:t xml:space="preserve"> Have</w:t>
-            </w:r>
+              <w:t xml:space="preserve"> </w:t>
+            </w:r>
+            <w:proofErr w:type="spellStart"/>
+            <w:r>
+              <w:t>Have</w:t>
+            </w:r>
+            <w:proofErr w:type="spellEnd"/>
           </w:p>
         </w:tc>
       </w:tr>
@@ -19075,8 +19463,13 @@
             </w:r>
             <w:proofErr w:type="spellEnd"/>
             <w:r>
-              <w:t xml:space="preserve"> Have</w:t>
-            </w:r>
+              <w:t xml:space="preserve"> </w:t>
+            </w:r>
+            <w:proofErr w:type="spellStart"/>
+            <w:r>
+              <w:t>Have</w:t>
+            </w:r>
+            <w:proofErr w:type="spellEnd"/>
           </w:p>
         </w:tc>
       </w:tr>
@@ -19112,8 +19505,13 @@
             </w:r>
             <w:proofErr w:type="spellEnd"/>
             <w:r>
-              <w:t xml:space="preserve"> Have</w:t>
-            </w:r>
+              <w:t xml:space="preserve"> </w:t>
+            </w:r>
+            <w:proofErr w:type="spellStart"/>
+            <w:r>
+              <w:t>Have</w:t>
+            </w:r>
+            <w:proofErr w:type="spellEnd"/>
           </w:p>
         </w:tc>
       </w:tr>
@@ -19214,10 +19612,10 @@
           <w:noProof/>
         </w:rPr>
         <w:drawing>
-          <wp:inline distT="0" distB="0" distL="0" distR="0" wp14:anchorId="5C6D75F6" wp14:editId="1EA00733">
-            <wp:extent cx="3200400" cy="2289175"/>
-            <wp:effectExtent l="0" t="0" r="0" b="0"/>
-            <wp:docPr id="1626505226" name="Imagen 3"/>
+          <wp:inline distT="0" distB="0" distL="0" distR="0" wp14:anchorId="3C32C0BD" wp14:editId="70383351">
+            <wp:extent cx="2769692" cy="1980000"/>
+            <wp:effectExtent l="0" t="0" r="0" b="1270"/>
+            <wp:docPr id="2" name="Imagen 2"/>
             <wp:cNvGraphicFramePr>
               <a:graphicFrameLocks xmlns:a="http://schemas.openxmlformats.org/drawingml/2006/main" noChangeAspect="1"/>
             </wp:cNvGraphicFramePr>
@@ -19225,10 +19623,8 @@
               <a:graphicData uri="http://schemas.openxmlformats.org/drawingml/2006/picture">
                 <pic:pic xmlns:pic="http://schemas.openxmlformats.org/drawingml/2006/picture">
                   <pic:nvPicPr>
-                    <pic:cNvPr id="0" name="Picture 1"/>
-                    <pic:cNvPicPr>
-                      <a:picLocks noChangeAspect="1" noChangeArrowheads="1"/>
-                    </pic:cNvPicPr>
+                    <pic:cNvPr id="2" name="Imagen 2"/>
+                    <pic:cNvPicPr/>
                   </pic:nvPicPr>
                   <pic:blipFill>
                     <a:blip r:embed="rId10" cstate="print">
@@ -19238,23 +19634,18 @@
                         </a:ext>
                       </a:extLst>
                     </a:blip>
-                    <a:srcRect/>
                     <a:stretch>
                       <a:fillRect/>
                     </a:stretch>
                   </pic:blipFill>
-                  <pic:spPr bwMode="auto">
+                  <pic:spPr>
                     <a:xfrm>
                       <a:off x="0" y="0"/>
-                      <a:ext cx="3200400" cy="2289175"/>
+                      <a:ext cx="2769692" cy="1980000"/>
                     </a:xfrm>
                     <a:prstGeom prst="rect">
                       <a:avLst/>
                     </a:prstGeom>
-                    <a:noFill/>
-                    <a:ln>
-                      <a:noFill/>
-                    </a:ln>
                   </pic:spPr>
                 </pic:pic>
               </a:graphicData>
@@ -19323,10 +19714,10 @@
           <w:noProof/>
         </w:rPr>
         <w:drawing>
-          <wp:inline distT="0" distB="0" distL="0" distR="0" wp14:anchorId="51745DE4" wp14:editId="17F542B1">
-            <wp:extent cx="3131109" cy="1940169"/>
-            <wp:effectExtent l="0" t="0" r="0" b="3175"/>
-            <wp:docPr id="1707182046" name="Imagen 4"/>
+          <wp:inline distT="0" distB="0" distL="0" distR="0" wp14:anchorId="06E4CE4C" wp14:editId="7EBFABD6">
+            <wp:extent cx="3134762" cy="1800000"/>
+            <wp:effectExtent l="0" t="0" r="8890" b="0"/>
+            <wp:docPr id="3" name="Imagen 3"/>
             <wp:cNvGraphicFramePr>
               <a:graphicFrameLocks xmlns:a="http://schemas.openxmlformats.org/drawingml/2006/main" noChangeAspect="1"/>
             </wp:cNvGraphicFramePr>
@@ -19334,10 +19725,8 @@
               <a:graphicData uri="http://schemas.openxmlformats.org/drawingml/2006/picture">
                 <pic:pic xmlns:pic="http://schemas.openxmlformats.org/drawingml/2006/picture">
                   <pic:nvPicPr>
-                    <pic:cNvPr id="0" name="Picture 3"/>
-                    <pic:cNvPicPr>
-                      <a:picLocks noChangeAspect="1" noChangeArrowheads="1"/>
-                    </pic:cNvPicPr>
+                    <pic:cNvPr id="3" name="Imagen 3"/>
+                    <pic:cNvPicPr/>
                   </pic:nvPicPr>
                   <pic:blipFill>
                     <a:blip r:embed="rId11" cstate="print">
@@ -19347,23 +19736,18 @@
                         </a:ext>
                       </a:extLst>
                     </a:blip>
-                    <a:srcRect/>
                     <a:stretch>
                       <a:fillRect/>
                     </a:stretch>
                   </pic:blipFill>
-                  <pic:spPr bwMode="auto">
+                  <pic:spPr>
                     <a:xfrm>
                       <a:off x="0" y="0"/>
-                      <a:ext cx="3163369" cy="1960159"/>
+                      <a:ext cx="3134762" cy="1800000"/>
                     </a:xfrm>
                     <a:prstGeom prst="rect">
                       <a:avLst/>
                     </a:prstGeom>
-                    <a:noFill/>
-                    <a:ln>
-                      <a:noFill/>
-                    </a:ln>
                   </pic:spPr>
                 </pic:pic>
               </a:graphicData>
@@ -19444,10 +19828,10 @@
           <w:noProof/>
         </w:rPr>
         <w:drawing>
-          <wp:inline distT="0" distB="0" distL="0" distR="0" wp14:anchorId="2B671CAA" wp14:editId="5FA6AAD9">
-            <wp:extent cx="3095073" cy="2872154"/>
-            <wp:effectExtent l="0" t="0" r="0" b="4445"/>
-            <wp:docPr id="1878496658" name="Imagen 5"/>
+          <wp:inline distT="0" distB="0" distL="0" distR="0" wp14:anchorId="74294B91" wp14:editId="2266C032">
+            <wp:extent cx="2907693" cy="2700000"/>
+            <wp:effectExtent l="0" t="0" r="6985" b="5715"/>
+            <wp:docPr id="5" name="Imagen 5"/>
             <wp:cNvGraphicFramePr>
               <a:graphicFrameLocks xmlns:a="http://schemas.openxmlformats.org/drawingml/2006/main" noChangeAspect="1"/>
             </wp:cNvGraphicFramePr>
@@ -19455,10 +19839,8 @@
               <a:graphicData uri="http://schemas.openxmlformats.org/drawingml/2006/picture">
                 <pic:pic xmlns:pic="http://schemas.openxmlformats.org/drawingml/2006/picture">
                   <pic:nvPicPr>
-                    <pic:cNvPr id="0" name="Picture 5"/>
-                    <pic:cNvPicPr>
-                      <a:picLocks noChangeAspect="1" noChangeArrowheads="1"/>
-                    </pic:cNvPicPr>
+                    <pic:cNvPr id="5" name="Imagen 5"/>
+                    <pic:cNvPicPr/>
                   </pic:nvPicPr>
                   <pic:blipFill>
                     <a:blip r:embed="rId12" cstate="print">
@@ -19468,23 +19850,18 @@
                         </a:ext>
                       </a:extLst>
                     </a:blip>
-                    <a:srcRect/>
                     <a:stretch>
                       <a:fillRect/>
                     </a:stretch>
                   </pic:blipFill>
-                  <pic:spPr bwMode="auto">
+                  <pic:spPr>
                     <a:xfrm>
                       <a:off x="0" y="0"/>
-                      <a:ext cx="3117028" cy="2892527"/>
+                      <a:ext cx="2907693" cy="2700000"/>
                     </a:xfrm>
                     <a:prstGeom prst="rect">
                       <a:avLst/>
                     </a:prstGeom>
-                    <a:noFill/>
-                    <a:ln>
-                      <a:noFill/>
-                    </a:ln>
                   </pic:spPr>
                 </pic:pic>
               </a:graphicData>
@@ -19555,7 +19932,6 @@
           <w:b/>
           <w:bCs/>
         </w:rPr>
-        <w:lastRenderedPageBreak/>
         <w:t xml:space="preserve">C4 </w:t>
       </w:r>
       <w:r>
@@ -19583,10 +19959,10 @@
           <w:noProof/>
         </w:rPr>
         <w:drawing>
-          <wp:inline distT="0" distB="0" distL="0" distR="0" wp14:anchorId="6C101ADD" wp14:editId="7B78AD8B">
-            <wp:extent cx="2643187" cy="2755869"/>
-            <wp:effectExtent l="0" t="0" r="5080" b="6985"/>
-            <wp:docPr id="2019399536" name="Imagen 7"/>
+          <wp:inline distT="0" distB="0" distL="0" distR="0" wp14:anchorId="2A0EA371" wp14:editId="4A9E9BB7">
+            <wp:extent cx="2682965" cy="2700000"/>
+            <wp:effectExtent l="0" t="0" r="3175" b="5715"/>
+            <wp:docPr id="6" name="Imagen 6"/>
             <wp:cNvGraphicFramePr>
               <a:graphicFrameLocks xmlns:a="http://schemas.openxmlformats.org/drawingml/2006/main" noChangeAspect="1"/>
             </wp:cNvGraphicFramePr>
@@ -19594,10 +19970,8 @@
               <a:graphicData uri="http://schemas.openxmlformats.org/drawingml/2006/picture">
                 <pic:pic xmlns:pic="http://schemas.openxmlformats.org/drawingml/2006/picture">
                   <pic:nvPicPr>
-                    <pic:cNvPr id="0" name="Picture 12"/>
-                    <pic:cNvPicPr>
-                      <a:picLocks noChangeAspect="1" noChangeArrowheads="1"/>
-                    </pic:cNvPicPr>
+                    <pic:cNvPr id="6" name="Imagen 6"/>
+                    <pic:cNvPicPr/>
                   </pic:nvPicPr>
                   <pic:blipFill>
                     <a:blip r:embed="rId13" cstate="print">
@@ -19607,23 +19981,18 @@
                         </a:ext>
                       </a:extLst>
                     </a:blip>
-                    <a:srcRect/>
                     <a:stretch>
                       <a:fillRect/>
                     </a:stretch>
                   </pic:blipFill>
-                  <pic:spPr bwMode="auto">
+                  <pic:spPr>
                     <a:xfrm>
                       <a:off x="0" y="0"/>
-                      <a:ext cx="2651462" cy="2764497"/>
+                      <a:ext cx="2682965" cy="2700000"/>
                     </a:xfrm>
                     <a:prstGeom prst="rect">
                       <a:avLst/>
                     </a:prstGeom>
-                    <a:noFill/>
-                    <a:ln>
-                      <a:noFill/>
-                    </a:ln>
                   </pic:spPr>
                 </pic:pic>
               </a:graphicData>
@@ -19722,7 +20091,23 @@
           <w:b/>
           <w:bCs/>
         </w:rPr>
-        <w:t xml:space="preserve"> Records)</w:t>
+        <w:t xml:space="preserve"> </w:t>
+      </w:r>
+      <w:proofErr w:type="spellStart"/>
+      <w:r>
+        <w:rPr>
+          <w:b/>
+          <w:bCs/>
+        </w:rPr>
+        <w:t>Records</w:t>
+      </w:r>
+      <w:proofErr w:type="spellEnd"/>
+      <w:r>
+        <w:rPr>
+          <w:b/>
+          <w:bCs/>
+        </w:rPr>
+        <w:t>)</w:t>
       </w:r>
       <w:bookmarkEnd w:id="22"/>
     </w:p>
@@ -19862,12 +20247,10 @@
         <w:t xml:space="preserve">, </w:t>
       </w:r>
       <w:proofErr w:type="spellStart"/>
-      <w:proofErr w:type="gramStart"/>
       <w:r>
         <w:t>apps.evaluations</w:t>
       </w:r>
       <w:proofErr w:type="spellEnd"/>
-      <w:proofErr w:type="gramEnd"/>
       <w:r>
         <w:t>, etc.).</w:t>
       </w:r>
@@ -20029,10 +20412,7 @@
         <w:t>Problema:</w:t>
       </w:r>
       <w:r>
-        <w:t xml:space="preserve"> ¿Cómo asegurar que el entorno de desarrollo sea 100% reproducible y portable entre cualquier equipo o servidor </w:t>
-      </w:r>
-      <w:r>
-        <w:t>sin errores de configuración?</w:t>
+        <w:t xml:space="preserve"> ¿Cómo asegurar que el entorno de desarrollo sea 100% reproducible y portable entre cualquier equipo o servidor sin errores de configuración?</w:t>
       </w:r>
     </w:p>
     <w:p>
@@ -20574,11 +20954,7 @@
       </w:r>
       <w:proofErr w:type="spellEnd"/>
       <w:r>
-        <w:t xml:space="preserve"> estructurada bajo </w:t>
-      </w:r>
-      <w:r>
-        <w:lastRenderedPageBreak/>
-        <w:t>/api/v1/ utilizando Django REST Framework.</w:t>
+        <w:t xml:space="preserve"> estructurada bajo /api/v1/ utilizando Django REST Framework.</w:t>
       </w:r>
     </w:p>
     <w:p>
@@ -20594,7 +20970,15 @@
         <w:t>Consecuencias</w:t>
       </w:r>
       <w:r>
-        <w:t>: Estándar intuitivo, generación automatizada de documentación Swagger/</w:t>
+        <w:t xml:space="preserve">: Estándar intuitivo, generación automatizada de documentación </w:t>
+      </w:r>
+      <w:proofErr w:type="spellStart"/>
+      <w:r>
+        <w:t>Swagger</w:t>
+      </w:r>
+      <w:proofErr w:type="spellEnd"/>
+      <w:r>
+        <w:t>/</w:t>
       </w:r>
       <w:proofErr w:type="spellStart"/>
       <w:r>
@@ -20694,7 +21078,11 @@
         <w:ind w:firstLine="204"/>
       </w:pPr>
       <w:r>
-        <w:t>La metodología Scrum fue seleccionada debido a que ofrece la flexibilidad necesaria para desarrollar un sistema cuyos requisitos pueden evolucionar durante el proyecto. En este caso, la plataforma está orientada a la evaluación y seguimiento de habilidades blandas, un ámbito en el que es común que los criterios de evaluación y las necesidades de los usuarios se ajusten a partir de la experiencia obtenida durante el desarrollo. Por ello, resulta conveniente trabajar con una metodología que facilite la adaptación a estos cambios sin afectar el avance del proyecto.</w:t>
+        <w:t xml:space="preserve">La metodología Scrum fue seleccionada debido a que ofrece la flexibilidad necesaria para desarrollar un sistema cuyos requisitos pueden evolucionar durante el proyecto. En este caso, la plataforma está orientada a la evaluación y seguimiento de habilidades blandas, un ámbito en el que es común que los criterios de evaluación y las necesidades de los usuarios se ajusten a partir de la experiencia obtenida durante el desarrollo. </w:t>
+      </w:r>
+      <w:r>
+        <w:lastRenderedPageBreak/>
+        <w:t>Por ello, resulta conveniente trabajar con una metodología que facilite la adaptación a estos cambios sin afectar el avance del proyecto.</w:t>
       </w:r>
     </w:p>
     <w:p>
@@ -20790,7 +21178,15 @@
       </w:r>
       <w:proofErr w:type="spellEnd"/>
       <w:r>
-        <w:t xml:space="preserve">/Common para servicios transversales (JWT, RBAC, manejo de excepciones, </w:t>
+        <w:t>/</w:t>
+      </w:r>
+      <w:proofErr w:type="spellStart"/>
+      <w:r>
+        <w:t>Common</w:t>
+      </w:r>
+      <w:proofErr w:type="spellEnd"/>
+      <w:r>
+        <w:t xml:space="preserve"> para servicios transversales (JWT, RBAC, manejo de excepciones, </w:t>
       </w:r>
       <w:proofErr w:type="spellStart"/>
       <w:r>
@@ -20936,7 +21332,10 @@
         <w:ind w:firstLine="204"/>
       </w:pPr>
       <w:r>
-        <w:t xml:space="preserve">Para el presente sistema universitario, el contexto específico justifica plenamente esta elección: equipo de desarrollo académico de tamaño reducido, dominio cohesionado donde todos los módulos comparten el contexto de "competencias blandas de estudiantes", carga predecible en el rango de cientos de usuarios concurrentes (no millones), necesidad de iteración rápida y recursos institucionales limitados que no justifican el costo operativo de un orquestador de microservicios con múltiples </w:t>
+        <w:t xml:space="preserve">Para el presente sistema universitario, el contexto específico justifica plenamente esta elección: equipo de desarrollo académico de tamaño reducido, dominio cohesionado donde todos los módulos comparten el contexto de "competencias blandas de estudiantes", carga predecible en el rango de cientos de usuarios concurrentes (no millones), necesidad de iteración rápida y recursos institucionales limitados que no justifican el costo operativo de un orquestador de microservicios con </w:t>
+      </w:r>
+      <w:r>
+        <w:t xml:space="preserve">múltiples </w:t>
       </w:r>
       <w:proofErr w:type="spellStart"/>
       <w:r>
@@ -21027,7 +21426,15 @@
       </w:r>
       <w:proofErr w:type="spellEnd"/>
       <w:r>
-        <w:t xml:space="preserve">/Common centraliza JWT, RBAC, manejadores de excepción y </w:t>
+        <w:t>/</w:t>
+      </w:r>
+      <w:proofErr w:type="spellStart"/>
+      <w:r>
+        <w:t>Common</w:t>
+      </w:r>
+      <w:proofErr w:type="spellEnd"/>
+      <w:r>
+        <w:t xml:space="preserve"> centraliza JWT, RBAC, manejadores de excepción y </w:t>
       </w:r>
       <w:proofErr w:type="spellStart"/>
       <w:r>
@@ -21083,11 +21490,11 @@
         </w:numPr>
       </w:pPr>
       <w:r>
-        <w:t>Consistencia transaccional: Los módulos comparten PostgreSQL 15, permitiendo transacciones ACID nativas entre entidades de diferentes módulos (p.ej., completar una actividad y registrar simultáneamente la evidencia y actualizar la analítica). En microservicios esto requeriría patrones complejos como Saga o Two-</w:t>
+        <w:t xml:space="preserve">Consistencia transaccional: Los módulos comparten PostgreSQL 15, permitiendo transacciones ACID nativas entre entidades de diferentes módulos (p.ej., completar una actividad y registrar simultáneamente la evidencia y actualizar la analítica). En microservicios esto requeriría patrones complejos como Saga o </w:t>
       </w:r>
       <w:proofErr w:type="spellStart"/>
       <w:r>
-        <w:t>Phase</w:t>
+        <w:t>Two-Phase</w:t>
       </w:r>
       <w:proofErr w:type="spellEnd"/>
       <w:r>
@@ -21279,7 +21686,6 @@
                 <w:sz w:val="16"/>
                 <w:szCs w:val="16"/>
               </w:rPr>
-              <w:lastRenderedPageBreak/>
               <w:t>Desventaja</w:t>
             </w:r>
           </w:p>
@@ -21658,7 +22064,23 @@
                 <w:sz w:val="16"/>
                 <w:szCs w:val="16"/>
               </w:rPr>
-              <w:t xml:space="preserve">/Common centraliza dependencias transversales. Richards (2022) señala que la </w:t>
+              <w:t>/</w:t>
+            </w:r>
+            <w:proofErr w:type="spellStart"/>
+            <w:r>
+              <w:rPr>
+                <w:sz w:val="16"/>
+                <w:szCs w:val="16"/>
+              </w:rPr>
+              <w:t>Common</w:t>
+            </w:r>
+            <w:proofErr w:type="spellEnd"/>
+            <w:r>
+              <w:rPr>
+                <w:sz w:val="16"/>
+                <w:szCs w:val="16"/>
+              </w:rPr>
+              <w:t xml:space="preserve"> centraliza dependencias transversales. Richards (2022) señala que la </w:t>
             </w:r>
             <w:proofErr w:type="spellStart"/>
             <w:r>
@@ -21714,6 +22136,7 @@
                 <w:sz w:val="16"/>
                 <w:szCs w:val="16"/>
               </w:rPr>
+              <w:lastRenderedPageBreak/>
               <w:t>Ciclos de despliegue completos</w:t>
             </w:r>
           </w:p>
@@ -22229,7 +22652,15 @@
       </w:r>
       <w:proofErr w:type="spellEnd"/>
       <w:r>
-        <w:t xml:space="preserve"> Fig </w:t>
+        <w:t xml:space="preserve"> </w:t>
+      </w:r>
+      <w:proofErr w:type="spellStart"/>
+      <w:r>
+        <w:t>Fig</w:t>
+      </w:r>
+      <w:proofErr w:type="spellEnd"/>
+      <w:r>
+        <w:t xml:space="preserve"> </w:t>
       </w:r>
       <w:proofErr w:type="spellStart"/>
       <w:r>
@@ -22369,15 +22800,26 @@
       </w:r>
       <w:proofErr w:type="spellEnd"/>
       <w:r>
-        <w:t xml:space="preserve">/Common centraliza </w:t>
+        <w:t>/</w:t>
       </w:r>
       <w:proofErr w:type="spellStart"/>
       <w:r>
+        <w:t>Common</w:t>
+      </w:r>
+      <w:proofErr w:type="spellEnd"/>
+      <w:r>
+        <w:t xml:space="preserve"> centraliza </w:t>
+      </w:r>
+      <w:proofErr w:type="spellStart"/>
+      <w:r>
         <w:t>auth</w:t>
       </w:r>
       <w:proofErr w:type="spellEnd"/>
       <w:r>
-        <w:t xml:space="preserve"> (JWT + RBAC), manejo de excepciones y configuración de base de datos, evitando duplicación. Según Richards, esta organización maximiza cohesión y minimiza acoplamiento.</w:t>
+        <w:t xml:space="preserve"> (JWT + RBAC), manejo de excepciones y configuración de base de datos, evitando duplicación. Según Richards, esta </w:t>
+      </w:r>
+      <w:r>
+        <w:t>organización maximiza cohesión y minimiza acoplamiento.</w:t>
       </w:r>
     </w:p>
     <w:p>
@@ -22783,8 +23225,17 @@
                 <w:sz w:val="16"/>
                 <w:szCs w:val="16"/>
               </w:rPr>
-              <w:t>/Vue</w:t>
-            </w:r>
+              <w:t>/</w:t>
+            </w:r>
+            <w:proofErr w:type="spellStart"/>
+            <w:r>
+              <w:rPr>
+                <w:sz w:val="16"/>
+                <w:szCs w:val="16"/>
+              </w:rPr>
+              <w:t>Vue</w:t>
+            </w:r>
+            <w:proofErr w:type="spellEnd"/>
           </w:p>
         </w:tc>
         <w:tc>
@@ -22934,7 +23385,23 @@
                 <w:sz w:val="16"/>
                 <w:szCs w:val="16"/>
               </w:rPr>
-              <w:t xml:space="preserve">Spring Boot / </w:t>
+              <w:t xml:space="preserve">Spring </w:t>
+            </w:r>
+            <w:proofErr w:type="spellStart"/>
+            <w:r>
+              <w:rPr>
+                <w:sz w:val="16"/>
+                <w:szCs w:val="16"/>
+              </w:rPr>
+              <w:t>Boot</w:t>
+            </w:r>
+            <w:proofErr w:type="spellEnd"/>
+            <w:r>
+              <w:rPr>
+                <w:sz w:val="16"/>
+                <w:szCs w:val="16"/>
+              </w:rPr>
+              <w:t xml:space="preserve"> / </w:t>
             </w:r>
             <w:proofErr w:type="spellStart"/>
             <w:r>
@@ -23040,8 +23507,17 @@
                 <w:sz w:val="16"/>
                 <w:szCs w:val="16"/>
               </w:rPr>
-              <w:t>/Common</w:t>
-            </w:r>
+              <w:t>/</w:t>
+            </w:r>
+            <w:proofErr w:type="spellStart"/>
+            <w:r>
+              <w:rPr>
+                <w:sz w:val="16"/>
+                <w:szCs w:val="16"/>
+              </w:rPr>
+              <w:t>Common</w:t>
+            </w:r>
+            <w:proofErr w:type="spellEnd"/>
           </w:p>
         </w:tc>
       </w:tr>
@@ -23249,7 +23725,6 @@
                 <w:sz w:val="16"/>
                 <w:szCs w:val="16"/>
               </w:rPr>
-              <w:lastRenderedPageBreak/>
               <w:t>redis</w:t>
             </w:r>
             <w:proofErr w:type="spellEnd"/>
@@ -23585,7 +24060,16 @@
       </w:r>
       <w:proofErr w:type="spellEnd"/>
       <w:r>
-        <w:t xml:space="preserve"> as a Service). El sistema se despliega sobre una plataforma de contenedores administrada —AWS ECS, Google Cloud Run, Azure Container Apps o equivalente— que gestiona el sistema operativo, la red, el escalado y la disponibilidad. El equipo de desarrollo se enfoca exclusivamente en el código y la configuración Docker, sin administrar servidores físicos ni sistemas operativos.</w:t>
+        <w:t xml:space="preserve"> as a </w:t>
+      </w:r>
+      <w:proofErr w:type="spellStart"/>
+      <w:r>
+        <w:lastRenderedPageBreak/>
+        <w:t>Service</w:t>
+      </w:r>
+      <w:proofErr w:type="spellEnd"/>
+      <w:r>
+        <w:t>). El sistema se despliega sobre una plataforma de contenedores administrada —AWS ECS, Google Cloud Run, Azure Container Apps o equivalente— que gestiona el sistema operativo, la red, el escalado y la disponibilidad. El equipo de desarrollo se enfoca exclusivamente en el código y la configuración Docker, sin administrar servidores físicos ni sistemas operativos.</w:t>
       </w:r>
     </w:p>
     <w:p>
@@ -24092,23 +24576,13 @@
                 <w:lang w:val="en-US"/>
               </w:rPr>
             </w:pPr>
-            <w:proofErr w:type="spellStart"/>
             <w:r>
               <w:rPr>
                 <w:sz w:val="16"/>
                 <w:szCs w:val="16"/>
                 <w:lang w:val="en-US"/>
               </w:rPr>
-              <w:t>MinIO</w:t>
-            </w:r>
-            <w:proofErr w:type="spellEnd"/>
-            <w:r>
-              <w:rPr>
-                <w:sz w:val="16"/>
-                <w:szCs w:val="16"/>
-                <w:lang w:val="en-US"/>
-              </w:rPr>
-              <w:t xml:space="preserve"> → S3 (AWS) o Cloud Storage (GCP)</w:t>
+              <w:t>MinIO → S3 (AWS) o Cloud Storage (GCP)</w:t>
             </w:r>
           </w:p>
         </w:tc>
@@ -24428,10 +24902,7 @@
       </w:r>
       <w:proofErr w:type="spellEnd"/>
       <w:r>
-        <w:t xml:space="preserve"> innecesario para un sistema universitario de escala media. Se descarta SaaS completo porque el sistema es una aplicación propia con lógica </w:t>
-      </w:r>
-      <w:r>
-        <w:t>de negocio específica de la institución.</w:t>
+        <w:t xml:space="preserve"> innecesario para un sistema universitario de escala media. Se descarta SaaS completo porque el sistema es una aplicación propia con lógica de negocio específica de la institución.</w:t>
       </w:r>
     </w:p>
     <w:p>
@@ -24535,7 +25006,10 @@
         </w:numPr>
       </w:pPr>
       <w:r>
-        <w:t>Seguridad: Los proveedores de nube pública cumplen con certificaciones ISO 27001, SOC 2 y normativas similares. Los datos de estudiantes se protegen con TLS en tránsito y cifrado en reposo, cumpliendo LOPDP.</w:t>
+        <w:t xml:space="preserve">Seguridad: Los proveedores de nube pública cumplen con certificaciones ISO 27001, SOC 2 y normativas similares. Los datos de estudiantes se protegen con TLS en tránsito y </w:t>
+      </w:r>
+      <w:r>
+        <w:t>cifrado en reposo, cumpliendo LOPDP.</w:t>
       </w:r>
     </w:p>
     <w:p>
@@ -24577,11 +25051,11 @@
       </w:r>
       <w:proofErr w:type="spellStart"/>
       <w:r>
-        <w:t>on</w:t>
+        <w:t>on-premise</w:t>
       </w:r>
       <w:proofErr w:type="spellEnd"/>
       <w:r>
-        <w:t>-premise, lo cual no aplica en este contexto universitario ecuatoriano. Se descarta Nube Híbrida porque añade complejidad de conectividad y gestión entre entornos sin que exista una justificación técnica o regulatoria que lo requiera.</w:t>
+        <w:t>, lo cual no aplica en este contexto universitario ecuatoriano. Se descarta Nube Híbrida porque añade complejidad de conectividad y gestión entre entornos sin que exista una justificación técnica o regulatoria que lo requiera.</w:t>
       </w:r>
     </w:p>
     <w:p>
@@ -24857,11 +25331,7 @@
       <w:proofErr w:type="spellEnd"/>
       <w:proofErr w:type="gramEnd"/>
       <w:r>
-        <w:t xml:space="preserve">: Módulo responsable del registro, autenticación </w:t>
-      </w:r>
-      <w:r>
-        <w:lastRenderedPageBreak/>
-        <w:t>mediante Tokens JWT (</w:t>
+        <w:t>: Módulo responsable del registro, autenticación mediante Tokens JWT (</w:t>
       </w:r>
       <w:proofErr w:type="spellStart"/>
       <w:r>
@@ -24943,6 +25413,7 @@
         <w:ind w:firstLine="204"/>
       </w:pPr>
       <w:r>
+        <w:lastRenderedPageBreak/>
         <w:t xml:space="preserve">• </w:t>
       </w:r>
       <w:proofErr w:type="spellStart"/>
@@ -25194,18 +25665,23 @@
       </w:r>
       <w:proofErr w:type="spellEnd"/>
       <w:r>
-        <w:t xml:space="preserve">/Vue) y el </w:t>
+        <w:t>/</w:t>
       </w:r>
       <w:proofErr w:type="spellStart"/>
       <w:r>
+        <w:t>Vue</w:t>
+      </w:r>
+      <w:proofErr w:type="spellEnd"/>
+      <w:r>
+        <w:t xml:space="preserve">) y el </w:t>
+      </w:r>
+      <w:proofErr w:type="spellStart"/>
+      <w:r>
         <w:t>backend</w:t>
       </w:r>
       <w:proofErr w:type="spellEnd"/>
       <w:r>
-        <w:t xml:space="preserve"> se realiza de manera sincrónica mediante protocolo HTTPS enviando y recibiendo cargas útiles en formato JSON. </w:t>
-      </w:r>
-      <w:r>
-        <w:t xml:space="preserve">Las peticiones REST son procesadas por Django REST Framework (DRF) y autenticadas mediante Tokens JWT incluidos en el encabezado </w:t>
+        <w:t xml:space="preserve"> se realiza de manera sincrónica mediante protocolo HTTPS enviando y recibiendo cargas útiles en formato JSON. Las peticiones REST son procesadas por Django REST Framework (DRF) y autenticadas mediante Tokens JWT incluidos en el encabezado </w:t>
       </w:r>
       <w:proofErr w:type="spellStart"/>
       <w:r>
@@ -25213,7 +25689,15 @@
       </w:r>
       <w:proofErr w:type="spellEnd"/>
       <w:r>
-        <w:t>: Bearer &lt;token&gt;. DRF verifica los permisos de cada usuario mediante clases de permiso personalizadas (</w:t>
+        <w:t xml:space="preserve">: </w:t>
+      </w:r>
+      <w:proofErr w:type="spellStart"/>
+      <w:r>
+        <w:t>Bearer</w:t>
+      </w:r>
+      <w:proofErr w:type="spellEnd"/>
+      <w:r>
+        <w:t xml:space="preserve"> &lt;token&gt;. DRF verifica los permisos de cada usuario mediante clases de permiso personalizadas (</w:t>
       </w:r>
       <w:proofErr w:type="spellStart"/>
       <w:r>
@@ -25298,7 +25782,7 @@
           <w:i/>
           <w:iCs/>
         </w:rPr>
-        <w:t xml:space="preserve"> (In-Process </w:t>
+        <w:t xml:space="preserve"> (In-</w:t>
       </w:r>
       <w:proofErr w:type="spellStart"/>
       <w:r>
@@ -25308,7 +25792,7 @@
           <w:i/>
           <w:iCs/>
         </w:rPr>
-        <w:t>Calls</w:t>
+        <w:t>Process</w:t>
       </w:r>
       <w:proofErr w:type="spellEnd"/>
       <w:r>
@@ -25318,7 +25802,7 @@
           <w:i/>
           <w:iCs/>
         </w:rPr>
-        <w:t xml:space="preserve"> &amp; Django </w:t>
+        <w:t xml:space="preserve"> </w:t>
       </w:r>
       <w:proofErr w:type="spellStart"/>
       <w:r>
@@ -25328,7 +25812,7 @@
           <w:i/>
           <w:iCs/>
         </w:rPr>
-        <w:t>Signals</w:t>
+        <w:t>Calls</w:t>
       </w:r>
       <w:proofErr w:type="spellEnd"/>
       <w:r>
@@ -25338,7 +25822,7 @@
           <w:i/>
           <w:iCs/>
         </w:rPr>
-        <w:t xml:space="preserve"> / </w:t>
+        <w:t xml:space="preserve"> &amp; Django </w:t>
       </w:r>
       <w:proofErr w:type="spellStart"/>
       <w:r>
@@ -25348,7 +25832,7 @@
           <w:i/>
           <w:iCs/>
         </w:rPr>
-        <w:t>Celery</w:t>
+        <w:t>Signals</w:t>
       </w:r>
       <w:proofErr w:type="spellEnd"/>
       <w:r>
@@ -25358,6 +25842,26 @@
           <w:i/>
           <w:iCs/>
         </w:rPr>
+        <w:t xml:space="preserve"> / </w:t>
+      </w:r>
+      <w:proofErr w:type="spellStart"/>
+      <w:r>
+        <w:rPr>
+          <w:b/>
+          <w:bCs/>
+          <w:i/>
+          <w:iCs/>
+        </w:rPr>
+        <w:t>Celery</w:t>
+      </w:r>
+      <w:proofErr w:type="spellEnd"/>
+      <w:r>
+        <w:rPr>
+          <w:b/>
+          <w:bCs/>
+          <w:i/>
+          <w:iCs/>
+        </w:rPr>
         <w:t>)</w:t>
       </w:r>
     </w:p>
@@ -25375,7 +25879,15 @@
       </w:r>
       <w:proofErr w:type="gramEnd"/>
       <w:r>
-        <w:t xml:space="preserve">) se ejecuta eficientemente dentro del mismo proceso de memoria (In-Process </w:t>
+        <w:t>) se ejecuta eficientemente dentro del mismo proceso de memoria (In-</w:t>
+      </w:r>
+      <w:proofErr w:type="spellStart"/>
+      <w:r>
+        <w:t>Process</w:t>
+      </w:r>
+      <w:proofErr w:type="spellEnd"/>
+      <w:r>
+        <w:t xml:space="preserve"> </w:t>
       </w:r>
       <w:proofErr w:type="spellStart"/>
       <w:r>
@@ -25417,7 +25929,18 @@
       </w:r>
       <w:proofErr w:type="spellEnd"/>
       <w:r>
-        <w:t>): Para desacoplar eventos del dominio (por ejemplo, cuando un estudiante completa una evaluación 360°), se emplean Django Signals (</w:t>
+        <w:t xml:space="preserve">): Para </w:t>
+      </w:r>
+      <w:r>
+        <w:t xml:space="preserve">desacoplar eventos del dominio (por ejemplo, cuando un estudiante completa una evaluación 360°), se emplean Django </w:t>
+      </w:r>
+      <w:proofErr w:type="spellStart"/>
+      <w:r>
+        <w:t>Signals</w:t>
+      </w:r>
+      <w:proofErr w:type="spellEnd"/>
+      <w:r>
+        <w:t xml:space="preserve"> (</w:t>
       </w:r>
       <w:proofErr w:type="spellStart"/>
       <w:r>
@@ -25446,12 +25969,10 @@
         <w:t xml:space="preserve"> para recalcular promedios y a </w:t>
       </w:r>
       <w:proofErr w:type="spellStart"/>
-      <w:proofErr w:type="gramStart"/>
       <w:r>
         <w:t>apps.notifications</w:t>
       </w:r>
       <w:proofErr w:type="spellEnd"/>
-      <w:proofErr w:type="gramEnd"/>
       <w:r>
         <w:t xml:space="preserve"> para registrar la alerta.</w:t>
       </w:r>
@@ -26344,7 +26865,6 @@
                 <w:sz w:val="16"/>
                 <w:szCs w:val="16"/>
               </w:rPr>
-              <w:lastRenderedPageBreak/>
               <w:t>apps.competencies</w:t>
             </w:r>
             <w:proofErr w:type="spellEnd"/>
@@ -26856,6 +27376,7 @@
                 <w:sz w:val="16"/>
                 <w:szCs w:val="16"/>
               </w:rPr>
+              <w:lastRenderedPageBreak/>
               <w:t>apps.evaluations</w:t>
             </w:r>
             <w:proofErr w:type="spellEnd"/>
@@ -28295,7 +28816,15 @@
       </w:r>
       <w:proofErr w:type="spellEnd"/>
       <w:r>
-        <w:t xml:space="preserve"> per Service </w:t>
+        <w:t xml:space="preserve"> per </w:t>
+      </w:r>
+      <w:proofErr w:type="spellStart"/>
+      <w:r>
+        <w:t>Service</w:t>
+      </w:r>
+      <w:proofErr w:type="spellEnd"/>
+      <w:r>
+        <w:t xml:space="preserve"> </w:t>
       </w:r>
       <w:proofErr w:type="spellStart"/>
       <w:r>
@@ -28961,7 +29490,15 @@
       </w:r>
       <w:proofErr w:type="spellEnd"/>
       <w:r>
-        <w:t xml:space="preserve"> Fig):</w:t>
+        <w:t xml:space="preserve"> </w:t>
+      </w:r>
+      <w:proofErr w:type="spellStart"/>
+      <w:r>
+        <w:t>Fig</w:t>
+      </w:r>
+      <w:proofErr w:type="spellEnd"/>
+      <w:r>
+        <w:t>):</w:t>
       </w:r>
     </w:p>
     <w:p>
@@ -29029,7 +29566,7 @@
 </file>
 
 <file path=word/endnotes.xml><?xml version="1.0" encoding="utf-8"?>
-<w:endnotes xmlns:wpc="http://schemas.microsoft.com/office/word/2010/wordprocessingCanvas" xmlns:cx="http://schemas.microsoft.com/office/drawing/2014/chartex" xmlns:cx1="http://schemas.microsoft.com/office/drawing/2015/9/8/chartex" xmlns:cx2="http://schemas.microsoft.com/office/drawing/2015/10/21/chartex" xmlns:cx3="http://schemas.microsoft.com/office/drawing/2016/5/9/chartex" xmlns:cx4="http://schemas.microsoft.com/office/drawing/2016/5/10/chartex" xmlns:cx5="http://schemas.microsoft.com/office/drawing/2016/5/11/chartex" xmlns:cx6="http://schemas.microsoft.com/office/drawing/2016/5/12/chartex" xmlns:cx7="http://schemas.microsoft.com/office/drawing/2016/5/13/chartex" xmlns:cx8="http://schemas.microsoft.com/office/drawing/2016/5/14/chartex" xmlns:mc="http://schemas.openxmlformats.org/markup-compatibility/2006" xmlns:aink="http://schemas.microsoft.com/office/drawing/2016/ink" xmlns:am3d="http://schemas.microsoft.com/office/drawing/2017/model3d" xmlns:o="urn:schemas-microsoft-com:office:office" xmlns:oel="http://schemas.microsoft.com/office/2019/extlst" xmlns:r="http://schemas.openxmlformats.org/officeDocument/2006/relationships" xmlns:m="http://schemas.openxmlformats.org/officeDocument/2006/math" xmlns:v="urn:schemas-microsoft-com:vml" xmlns:wp14="http://schemas.microsoft.com/office/word/2010/wordprocessingDrawing" xmlns:wp="http://schemas.openxmlformats.org/drawingml/2006/wordprocessingDrawing" xmlns:w10="urn:schemas-microsoft-com:office:word" xmlns:w="http://schemas.openxmlformats.org/wordprocessingml/2006/main" xmlns:w14="http://schemas.microsoft.com/office/word/2010/wordml" xmlns:w15="http://schemas.microsoft.com/office/word/2012/wordml" xmlns:w16cex="http://schemas.microsoft.com/office/word/2018/wordml/cex" xmlns:w16cid="http://schemas.microsoft.com/office/word/2016/wordml/cid" xmlns:w16="http://schemas.microsoft.com/office/word/2018/wordml" xmlns:w16du="http://schemas.microsoft.com/office/word/2023/wordml/word16du" xmlns:w16sdtdh="http://schemas.microsoft.com/office/word/2020/wordml/sdtdatahash" xmlns:w16sdtfl="http://schemas.microsoft.com/office/word/2024/wordml/sdtformatlock" xmlns:w16se="http://schemas.microsoft.com/office/word/2015/wordml/symex" xmlns:wpg="http://schemas.microsoft.com/office/word/2010/wordprocessingGroup" xmlns:wpi="http://schemas.microsoft.com/office/word/2010/wordprocessingInk" xmlns:wne="http://schemas.microsoft.com/office/word/2006/wordml" xmlns:wps="http://schemas.microsoft.com/office/word/2010/wordprocessingShape" mc:Ignorable="w14 w15 w16se w16cid w16 w16cex w16sdtdh w16sdtfl w16du wp14">
+<w:endnotes xmlns:wpc="http://schemas.microsoft.com/office/word/2010/wordprocessingCanvas" xmlns:cx="http://schemas.microsoft.com/office/drawing/2014/chartex" xmlns:cx1="http://schemas.microsoft.com/office/drawing/2015/9/8/chartex" xmlns:cx2="http://schemas.microsoft.com/office/drawing/2015/10/21/chartex" xmlns:cx3="http://schemas.microsoft.com/office/drawing/2016/5/9/chartex" xmlns:cx4="http://schemas.microsoft.com/office/drawing/2016/5/10/chartex" xmlns:cx5="http://schemas.microsoft.com/office/drawing/2016/5/11/chartex" xmlns:cx6="http://schemas.microsoft.com/office/drawing/2016/5/12/chartex" xmlns:cx7="http://schemas.microsoft.com/office/drawing/2016/5/13/chartex" xmlns:cx8="http://schemas.microsoft.com/office/drawing/2016/5/14/chartex" xmlns:mc="http://schemas.openxmlformats.org/markup-compatibility/2006" xmlns:aink="http://schemas.microsoft.com/office/drawing/2016/ink" xmlns:am3d="http://schemas.microsoft.com/office/drawing/2017/model3d" xmlns:o="urn:schemas-microsoft-com:office:office" xmlns:r="http://schemas.openxmlformats.org/officeDocument/2006/relationships" xmlns:m="http://schemas.openxmlformats.org/officeDocument/2006/math" xmlns:v="urn:schemas-microsoft-com:vml" xmlns:wp14="http://schemas.microsoft.com/office/word/2010/wordprocessingDrawing" xmlns:wp="http://schemas.openxmlformats.org/drawingml/2006/wordprocessingDrawing" xmlns:w10="urn:schemas-microsoft-com:office:word" xmlns:w="http://schemas.openxmlformats.org/wordprocessingml/2006/main" xmlns:w14="http://schemas.microsoft.com/office/word/2010/wordml" xmlns:w15="http://schemas.microsoft.com/office/word/2012/wordml" xmlns:w16cex="http://schemas.microsoft.com/office/word/2018/wordml/cex" xmlns:w16cid="http://schemas.microsoft.com/office/word/2016/wordml/cid" xmlns:w16="http://schemas.microsoft.com/office/word/2018/wordml" xmlns:w16se="http://schemas.microsoft.com/office/word/2015/wordml/symex" xmlns:wpg="http://schemas.microsoft.com/office/word/2010/wordprocessingGroup" xmlns:wpi="http://schemas.microsoft.com/office/word/2010/wordprocessingInk" xmlns:wne="http://schemas.microsoft.com/office/word/2006/wordml" xmlns:wps="http://schemas.microsoft.com/office/word/2010/wordprocessingShape" mc:Ignorable="w14 w15 w16se w16cid w16 w16cex wp14">
   <w:endnote w:type="separator" w:id="-1">
     <w:p>
       <w:r>
@@ -29048,7 +29585,7 @@
 </file>
 
 <file path=word/footnotes.xml><?xml version="1.0" encoding="utf-8"?>
-<w:footnotes xmlns:wpc="http://schemas.microsoft.com/office/word/2010/wordprocessingCanvas" xmlns:cx="http://schemas.microsoft.com/office/drawing/2014/chartex" xmlns:cx1="http://schemas.microsoft.com/office/drawing/2015/9/8/chartex" xmlns:cx2="http://schemas.microsoft.com/office/drawing/2015/10/21/chartex" xmlns:cx3="http://schemas.microsoft.com/office/drawing/2016/5/9/chartex" xmlns:cx4="http://schemas.microsoft.com/office/drawing/2016/5/10/chartex" xmlns:cx5="http://schemas.microsoft.com/office/drawing/2016/5/11/chartex" xmlns:cx6="http://schemas.microsoft.com/office/drawing/2016/5/12/chartex" xmlns:cx7="http://schemas.microsoft.com/office/drawing/2016/5/13/chartex" xmlns:cx8="http://schemas.microsoft.com/office/drawing/2016/5/14/chartex" xmlns:mc="http://schemas.openxmlformats.org/markup-compatibility/2006" xmlns:aink="http://schemas.microsoft.com/office/drawing/2016/ink" xmlns:am3d="http://schemas.microsoft.com/office/drawing/2017/model3d" xmlns:o="urn:schemas-microsoft-com:office:office" xmlns:oel="http://schemas.microsoft.com/office/2019/extlst" xmlns:r="http://schemas.openxmlformats.org/officeDocument/2006/relationships" xmlns:m="http://schemas.openxmlformats.org/officeDocument/2006/math" xmlns:v="urn:schemas-microsoft-com:vml" xmlns:wp14="http://schemas.microsoft.com/office/word/2010/wordprocessingDrawing" xmlns:wp="http://schemas.openxmlformats.org/drawingml/2006/wordprocessingDrawing" xmlns:w10="urn:schemas-microsoft-com:office:word" xmlns:w="http://schemas.openxmlformats.org/wordprocessingml/2006/main" xmlns:w14="http://schemas.microsoft.com/office/word/2010/wordml" xmlns:w15="http://schemas.microsoft.com/office/word/2012/wordml" xmlns:w16cex="http://schemas.microsoft.com/office/word/2018/wordml/cex" xmlns:w16cid="http://schemas.microsoft.com/office/word/2016/wordml/cid" xmlns:w16="http://schemas.microsoft.com/office/word/2018/wordml" xmlns:w16du="http://schemas.microsoft.com/office/word/2023/wordml/word16du" xmlns:w16sdtdh="http://schemas.microsoft.com/office/word/2020/wordml/sdtdatahash" xmlns:w16sdtfl="http://schemas.microsoft.com/office/word/2024/wordml/sdtformatlock" xmlns:w16se="http://schemas.microsoft.com/office/word/2015/wordml/symex" xmlns:wpg="http://schemas.microsoft.com/office/word/2010/wordprocessingGroup" xmlns:wpi="http://schemas.microsoft.com/office/word/2010/wordprocessingInk" xmlns:wne="http://schemas.microsoft.com/office/word/2006/wordml" xmlns:wps="http://schemas.microsoft.com/office/word/2010/wordprocessingShape" mc:Ignorable="w14 w15 w16se w16cid w16 w16cex w16sdtdh w16sdtfl w16du wp14">
+<w:footnotes xmlns:wpc="http://schemas.microsoft.com/office/word/2010/wordprocessingCanvas" xmlns:cx="http://schemas.microsoft.com/office/drawing/2014/chartex" xmlns:cx1="http://schemas.microsoft.com/office/drawing/2015/9/8/chartex" xmlns:cx2="http://schemas.microsoft.com/office/drawing/2015/10/21/chartex" xmlns:cx3="http://schemas.microsoft.com/office/drawing/2016/5/9/chartex" xmlns:cx4="http://schemas.microsoft.com/office/drawing/2016/5/10/chartex" xmlns:cx5="http://schemas.microsoft.com/office/drawing/2016/5/11/chartex" xmlns:cx6="http://schemas.microsoft.com/office/drawing/2016/5/12/chartex" xmlns:cx7="http://schemas.microsoft.com/office/drawing/2016/5/13/chartex" xmlns:cx8="http://schemas.microsoft.com/office/drawing/2016/5/14/chartex" xmlns:mc="http://schemas.openxmlformats.org/markup-compatibility/2006" xmlns:aink="http://schemas.microsoft.com/office/drawing/2016/ink" xmlns:am3d="http://schemas.microsoft.com/office/drawing/2017/model3d" xmlns:o="urn:schemas-microsoft-com:office:office" xmlns:r="http://schemas.openxmlformats.org/officeDocument/2006/relationships" xmlns:m="http://schemas.openxmlformats.org/officeDocument/2006/math" xmlns:v="urn:schemas-microsoft-com:vml" xmlns:wp14="http://schemas.microsoft.com/office/word/2010/wordprocessingDrawing" xmlns:wp="http://schemas.openxmlformats.org/drawingml/2006/wordprocessingDrawing" xmlns:w10="urn:schemas-microsoft-com:office:word" xmlns:w="http://schemas.openxmlformats.org/wordprocessingml/2006/main" xmlns:w14="http://schemas.microsoft.com/office/word/2010/wordml" xmlns:w15="http://schemas.microsoft.com/office/word/2012/wordml" xmlns:w16cex="http://schemas.microsoft.com/office/word/2018/wordml/cex" xmlns:w16cid="http://schemas.microsoft.com/office/word/2016/wordml/cid" xmlns:w16="http://schemas.microsoft.com/office/word/2018/wordml" xmlns:w16se="http://schemas.microsoft.com/office/word/2015/wordml/symex" xmlns:wpg="http://schemas.microsoft.com/office/word/2010/wordprocessingGroup" xmlns:wpi="http://schemas.microsoft.com/office/word/2010/wordprocessingInk" xmlns:wne="http://schemas.microsoft.com/office/word/2006/wordml" xmlns:wps="http://schemas.microsoft.com/office/word/2010/wordprocessingShape" mc:Ignorable="w14 w15 w16se w16cid w16 w16cex wp14">
   <w:footnote w:type="separator" w:id="-1">
     <w:p>
       <w:pPr>
@@ -29077,7 +29614,7 @@
 </file>
 
 <file path=word/header1.xml><?xml version="1.0" encoding="utf-8"?>
-<w:hdr xmlns:wpc="http://schemas.microsoft.com/office/word/2010/wordprocessingCanvas" xmlns:cx="http://schemas.microsoft.com/office/drawing/2014/chartex" xmlns:cx1="http://schemas.microsoft.com/office/drawing/2015/9/8/chartex" xmlns:cx2="http://schemas.microsoft.com/office/drawing/2015/10/21/chartex" xmlns:cx3="http://schemas.microsoft.com/office/drawing/2016/5/9/chartex" xmlns:cx4="http://schemas.microsoft.com/office/drawing/2016/5/10/chartex" xmlns:cx5="http://schemas.microsoft.com/office/drawing/2016/5/11/chartex" xmlns:cx6="http://schemas.microsoft.com/office/drawing/2016/5/12/chartex" xmlns:cx7="http://schemas.microsoft.com/office/drawing/2016/5/13/chartex" xmlns:cx8="http://schemas.microsoft.com/office/drawing/2016/5/14/chartex" xmlns:mc="http://schemas.openxmlformats.org/markup-compatibility/2006" xmlns:aink="http://schemas.microsoft.com/office/drawing/2016/ink" xmlns:am3d="http://schemas.microsoft.com/office/drawing/2017/model3d" xmlns:o="urn:schemas-microsoft-com:office:office" xmlns:oel="http://schemas.microsoft.com/office/2019/extlst" xmlns:r="http://schemas.openxmlformats.org/officeDocument/2006/relationships" xmlns:m="http://schemas.openxmlformats.org/officeDocument/2006/math" xmlns:v="urn:schemas-microsoft-com:vml" xmlns:wp14="http://schemas.microsoft.com/office/word/2010/wordprocessingDrawing" xmlns:wp="http://schemas.openxmlformats.org/drawingml/2006/wordprocessingDrawing" xmlns:w10="urn:schemas-microsoft-com:office:word" xmlns:w="http://schemas.openxmlformats.org/wordprocessingml/2006/main" xmlns:w14="http://schemas.microsoft.com/office/word/2010/wordml" xmlns:w15="http://schemas.microsoft.com/office/word/2012/wordml" xmlns:w16cex="http://schemas.microsoft.com/office/word/2018/wordml/cex" xmlns:w16cid="http://schemas.microsoft.com/office/word/2016/wordml/cid" xmlns:w16="http://schemas.microsoft.com/office/word/2018/wordml" xmlns:w16du="http://schemas.microsoft.com/office/word/2023/wordml/word16du" xmlns:w16sdtdh="http://schemas.microsoft.com/office/word/2020/wordml/sdtdatahash" xmlns:w16sdtfl="http://schemas.microsoft.com/office/word/2024/wordml/sdtformatlock" xmlns:w16se="http://schemas.microsoft.com/office/word/2015/wordml/symex" xmlns:wpg="http://schemas.microsoft.com/office/word/2010/wordprocessingGroup" xmlns:wpi="http://schemas.microsoft.com/office/word/2010/wordprocessingInk" xmlns:wne="http://schemas.microsoft.com/office/word/2006/wordml" xmlns:wps="http://schemas.microsoft.com/office/word/2010/wordprocessingShape" mc:Ignorable="w14 w15 w16se w16cid w16 w16cex w16sdtdh w16sdtfl w16du wp14">
+<w:hdr xmlns:wpc="http://schemas.microsoft.com/office/word/2010/wordprocessingCanvas" xmlns:cx="http://schemas.microsoft.com/office/drawing/2014/chartex" xmlns:cx1="http://schemas.microsoft.com/office/drawing/2015/9/8/chartex" xmlns:cx2="http://schemas.microsoft.com/office/drawing/2015/10/21/chartex" xmlns:cx3="http://schemas.microsoft.com/office/drawing/2016/5/9/chartex" xmlns:cx4="http://schemas.microsoft.com/office/drawing/2016/5/10/chartex" xmlns:cx5="http://schemas.microsoft.com/office/drawing/2016/5/11/chartex" xmlns:cx6="http://schemas.microsoft.com/office/drawing/2016/5/12/chartex" xmlns:cx7="http://schemas.microsoft.com/office/drawing/2016/5/13/chartex" xmlns:cx8="http://schemas.microsoft.com/office/drawing/2016/5/14/chartex" xmlns:mc="http://schemas.openxmlformats.org/markup-compatibility/2006" xmlns:aink="http://schemas.microsoft.com/office/drawing/2016/ink" xmlns:am3d="http://schemas.microsoft.com/office/drawing/2017/model3d" xmlns:o="urn:schemas-microsoft-com:office:office" xmlns:r="http://schemas.openxmlformats.org/officeDocument/2006/relationships" xmlns:m="http://schemas.openxmlformats.org/officeDocument/2006/math" xmlns:v="urn:schemas-microsoft-com:vml" xmlns:wp14="http://schemas.microsoft.com/office/word/2010/wordprocessingDrawing" xmlns:wp="http://schemas.openxmlformats.org/drawingml/2006/wordprocessingDrawing" xmlns:w10="urn:schemas-microsoft-com:office:word" xmlns:w="http://schemas.openxmlformats.org/wordprocessingml/2006/main" xmlns:w14="http://schemas.microsoft.com/office/word/2010/wordml" xmlns:w15="http://schemas.microsoft.com/office/word/2012/wordml" xmlns:w16cex="http://schemas.microsoft.com/office/word/2018/wordml/cex" xmlns:w16cid="http://schemas.microsoft.com/office/word/2016/wordml/cid" xmlns:w16="http://schemas.microsoft.com/office/word/2018/wordml" xmlns:w16se="http://schemas.microsoft.com/office/word/2015/wordml/symex" xmlns:wpg="http://schemas.microsoft.com/office/word/2010/wordprocessingGroup" xmlns:wpi="http://schemas.microsoft.com/office/word/2010/wordprocessingInk" xmlns:wne="http://schemas.microsoft.com/office/word/2006/wordml" xmlns:wps="http://schemas.microsoft.com/office/word/2010/wordprocessingShape" mc:Ignorable="w14 w15 w16se w16cid w16 w16cex wp14">
   <w:p>
     <w:pPr>
       <w:jc w:val="center"/>
@@ -29162,7 +29699,7 @@
               <v:stroke joinstyle="miter"/>
               <v:path gradientshapeok="t" o:connecttype="rect"/>
             </v:shapetype>
-            <v:shape id="Frame3" o:spid="_x0000_s1031" type="#_x0000_t202" style="position:absolute;left:0;text-align:left;margin-left:-41.15pt;margin-top:.05pt;width:10.05pt;height:11.55pt;z-index:18;visibility:visible;mso-wrap-style:square;mso-wrap-distance-left:0;mso-wrap-distance-top:0;mso-wrap-distance-right:0;mso-wrap-distance-bottom:0;mso-position-horizontal:right;mso-position-horizontal-relative:margin;mso-position-vertical:absolute;mso-position-vertical-relative:text;v-text-anchor:top" o:gfxdata="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" o:allowincell="f" stroked="f">
+            <v:shape id="Frame3" o:spid="_x0000_s1031" type="#_x0000_t202" style="position:absolute;left:0;text-align:left;margin-left:-41.15pt;margin-top:.05pt;width:10.05pt;height:11.55pt;z-index:18;visibility:visible;mso-wrap-style:square;mso-wrap-distance-left:0;mso-wrap-distance-top:0;mso-wrap-distance-right:0;mso-wrap-distance-bottom:0;mso-position-horizontal:right;mso-position-horizontal-relative:margin;mso-position-vertical:absolute;mso-position-vertical-relative:text;v-text-anchor:top" o:gfxdata="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" o:allowincell="f" stroked="f">
               <v:fill opacity="0"/>
               <v:textbox inset="0,0,0,0">
                 <w:txbxContent>
@@ -29205,7 +29742,7 @@
 </file>
 
 <file path=word/numbering.xml><?xml version="1.0" encoding="utf-8"?>
-<w:numbering xmlns:wpc="http://schemas.microsoft.com/office/word/2010/wordprocessingCanvas" xmlns:cx="http://schemas.microsoft.com/office/drawing/2014/chartex" xmlns:cx1="http://schemas.microsoft.com/office/drawing/2015/9/8/chartex" xmlns:cx2="http://schemas.microsoft.com/office/drawing/2015/10/21/chartex" xmlns:cx3="http://schemas.microsoft.com/office/drawing/2016/5/9/chartex" xmlns:cx4="http://schemas.microsoft.com/office/drawing/2016/5/10/chartex" xmlns:cx5="http://schemas.microsoft.com/office/drawing/2016/5/11/chartex" xmlns:cx6="http://schemas.microsoft.com/office/drawing/2016/5/12/chartex" xmlns:cx7="http://schemas.microsoft.com/office/drawing/2016/5/13/chartex" xmlns:cx8="http://schemas.microsoft.com/office/drawing/2016/5/14/chartex" xmlns:mc="http://schemas.openxmlformats.org/markup-compatibility/2006" xmlns:aink="http://schemas.microsoft.com/office/drawing/2016/ink" xmlns:am3d="http://schemas.microsoft.com/office/drawing/2017/model3d" xmlns:o="urn:schemas-microsoft-com:office:office" xmlns:oel="http://schemas.microsoft.com/office/2019/extlst" xmlns:r="http://schemas.openxmlformats.org/officeDocument/2006/relationships" xmlns:m="http://schemas.openxmlformats.org/officeDocument/2006/math" xmlns:v="urn:schemas-microsoft-com:vml" xmlns:wp14="http://schemas.microsoft.com/office/word/2010/wordprocessingDrawing" xmlns:wp="http://schemas.openxmlformats.org/drawingml/2006/wordprocessingDrawing" xmlns:w10="urn:schemas-microsoft-com:office:word" xmlns:w="http://schemas.openxmlformats.org/wordprocessingml/2006/main" xmlns:w14="http://schemas.microsoft.com/office/word/2010/wordml" xmlns:w15="http://schemas.microsoft.com/office/word/2012/wordml" xmlns:w16cex="http://schemas.microsoft.com/office/word/2018/wordml/cex" xmlns:w16cid="http://schemas.microsoft.com/office/word/2016/wordml/cid" xmlns:w16="http://schemas.microsoft.com/office/word/2018/wordml" xmlns:w16du="http://schemas.microsoft.com/office/word/2023/wordml/word16du" xmlns:w16sdtdh="http://schemas.microsoft.com/office/word/2020/wordml/sdtdatahash" xmlns:w16sdtfl="http://schemas.microsoft.com/office/word/2024/wordml/sdtformatlock" xmlns:w16se="http://schemas.microsoft.com/office/word/2015/wordml/symex" xmlns:wpg="http://schemas.microsoft.com/office/word/2010/wordprocessingGroup" xmlns:wpi="http://schemas.microsoft.com/office/word/2010/wordprocessingInk" xmlns:wne="http://schemas.microsoft.com/office/word/2006/wordml" xmlns:wps="http://schemas.microsoft.com/office/word/2010/wordprocessingShape" mc:Ignorable="w14 w15 w16se w16cid w16 w16cex w16sdtdh w16sdtfl w16du wp14">
+<w:numbering xmlns:wpc="http://schemas.microsoft.com/office/word/2010/wordprocessingCanvas" xmlns:cx="http://schemas.microsoft.com/office/drawing/2014/chartex" xmlns:cx1="http://schemas.microsoft.com/office/drawing/2015/9/8/chartex" xmlns:cx2="http://schemas.microsoft.com/office/drawing/2015/10/21/chartex" xmlns:cx3="http://schemas.microsoft.com/office/drawing/2016/5/9/chartex" xmlns:cx4="http://schemas.microsoft.com/office/drawing/2016/5/10/chartex" xmlns:cx5="http://schemas.microsoft.com/office/drawing/2016/5/11/chartex" xmlns:cx6="http://schemas.microsoft.com/office/drawing/2016/5/12/chartex" xmlns:cx7="http://schemas.microsoft.com/office/drawing/2016/5/13/chartex" xmlns:cx8="http://schemas.microsoft.com/office/drawing/2016/5/14/chartex" xmlns:mc="http://schemas.openxmlformats.org/markup-compatibility/2006" xmlns:aink="http://schemas.microsoft.com/office/drawing/2016/ink" xmlns:am3d="http://schemas.microsoft.com/office/drawing/2017/model3d" xmlns:o="urn:schemas-microsoft-com:office:office" xmlns:r="http://schemas.openxmlformats.org/officeDocument/2006/relationships" xmlns:m="http://schemas.openxmlformats.org/officeDocument/2006/math" xmlns:v="urn:schemas-microsoft-com:vml" xmlns:wp14="http://schemas.microsoft.com/office/word/2010/wordprocessingDrawing" xmlns:wp="http://schemas.openxmlformats.org/drawingml/2006/wordprocessingDrawing" xmlns:w10="urn:schemas-microsoft-com:office:word" xmlns:w="http://schemas.openxmlformats.org/wordprocessingml/2006/main" xmlns:w14="http://schemas.microsoft.com/office/word/2010/wordml" xmlns:w15="http://schemas.microsoft.com/office/word/2012/wordml" xmlns:w16cex="http://schemas.microsoft.com/office/word/2018/wordml/cex" xmlns:w16cid="http://schemas.microsoft.com/office/word/2016/wordml/cid" xmlns:w16="http://schemas.microsoft.com/office/word/2018/wordml" xmlns:w16se="http://schemas.microsoft.com/office/word/2015/wordml/symex" xmlns:wpg="http://schemas.microsoft.com/office/word/2010/wordprocessingGroup" xmlns:wpi="http://schemas.microsoft.com/office/word/2010/wordprocessingInk" xmlns:wne="http://schemas.microsoft.com/office/word/2006/wordml" xmlns:wps="http://schemas.microsoft.com/office/word/2010/wordprocessingShape" mc:Ignorable="w14 w15 w16se w16cid w16 w16cex wp14">
   <w:abstractNum w:abstractNumId="0" w15:restartNumberingAfterBreak="0">
     <w:nsid w:val="00A97CB6"/>
     <w:multiLevelType w:val="multilevel"/>
@@ -30849,101 +31386,101 @@
       <w:lvlJc w:val="left"/>
     </w:lvl>
   </w:abstractNum>
-  <w:num w:numId="1" w16cid:durableId="534001176">
+  <w:num w:numId="1">
     <w:abstractNumId w:val="3"/>
   </w:num>
-  <w:num w:numId="2" w16cid:durableId="2038462010">
+  <w:num w:numId="2">
     <w:abstractNumId w:val="10"/>
   </w:num>
-  <w:num w:numId="3" w16cid:durableId="964431731">
+  <w:num w:numId="3">
     <w:abstractNumId w:val="2"/>
   </w:num>
-  <w:num w:numId="4" w16cid:durableId="1876041318">
+  <w:num w:numId="4">
     <w:abstractNumId w:val="13"/>
   </w:num>
-  <w:num w:numId="5" w16cid:durableId="432014595">
+  <w:num w:numId="5">
     <w:abstractNumId w:val="11"/>
   </w:num>
-  <w:num w:numId="6" w16cid:durableId="582036130">
+  <w:num w:numId="6">
     <w:abstractNumId w:val="5"/>
   </w:num>
-  <w:num w:numId="7" w16cid:durableId="1695813288">
+  <w:num w:numId="7">
     <w:abstractNumId w:val="1"/>
   </w:num>
-  <w:num w:numId="8" w16cid:durableId="1162310709">
+  <w:num w:numId="8">
     <w:abstractNumId w:val="3"/>
   </w:num>
-  <w:num w:numId="9" w16cid:durableId="1309550326">
+  <w:num w:numId="9">
     <w:abstractNumId w:val="3"/>
   </w:num>
-  <w:num w:numId="10" w16cid:durableId="876158725">
+  <w:num w:numId="10">
     <w:abstractNumId w:val="8"/>
   </w:num>
-  <w:num w:numId="11" w16cid:durableId="1533960633">
+  <w:num w:numId="11">
     <w:abstractNumId w:val="3"/>
   </w:num>
-  <w:num w:numId="12" w16cid:durableId="1990941445">
+  <w:num w:numId="12">
     <w:abstractNumId w:val="3"/>
   </w:num>
-  <w:num w:numId="13" w16cid:durableId="55475736">
+  <w:num w:numId="13">
     <w:abstractNumId w:val="4"/>
   </w:num>
-  <w:num w:numId="14" w16cid:durableId="1053848204">
+  <w:num w:numId="14">
     <w:abstractNumId w:val="0"/>
   </w:num>
-  <w:num w:numId="15" w16cid:durableId="1491484875">
+  <w:num w:numId="15">
     <w:abstractNumId w:val="3"/>
   </w:num>
-  <w:num w:numId="16" w16cid:durableId="548612488">
+  <w:num w:numId="16">
     <w:abstractNumId w:val="9"/>
   </w:num>
-  <w:num w:numId="17" w16cid:durableId="864057103">
+  <w:num w:numId="17">
     <w:abstractNumId w:val="3"/>
   </w:num>
-  <w:num w:numId="18" w16cid:durableId="1628318639">
+  <w:num w:numId="18">
     <w:abstractNumId w:val="3"/>
   </w:num>
-  <w:num w:numId="19" w16cid:durableId="1390768011">
+  <w:num w:numId="19">
     <w:abstractNumId w:val="6"/>
   </w:num>
-  <w:num w:numId="20" w16cid:durableId="1361006502">
+  <w:num w:numId="20">
     <w:abstractNumId w:val="3"/>
   </w:num>
-  <w:num w:numId="21" w16cid:durableId="1929541354">
+  <w:num w:numId="21">
     <w:abstractNumId w:val="7"/>
   </w:num>
-  <w:num w:numId="22" w16cid:durableId="1977182006">
+  <w:num w:numId="22">
     <w:abstractNumId w:val="3"/>
   </w:num>
-  <w:num w:numId="23" w16cid:durableId="711225103">
+  <w:num w:numId="23">
     <w:abstractNumId w:val="3"/>
   </w:num>
-  <w:num w:numId="24" w16cid:durableId="556626417">
+  <w:num w:numId="24">
     <w:abstractNumId w:val="3"/>
   </w:num>
-  <w:num w:numId="25" w16cid:durableId="356664453">
+  <w:num w:numId="25">
     <w:abstractNumId w:val="3"/>
   </w:num>
-  <w:num w:numId="26" w16cid:durableId="1148280195">
+  <w:num w:numId="26">
     <w:abstractNumId w:val="3"/>
   </w:num>
-  <w:num w:numId="27" w16cid:durableId="588587502">
+  <w:num w:numId="27">
     <w:abstractNumId w:val="3"/>
   </w:num>
-  <w:num w:numId="28" w16cid:durableId="1480228394">
+  <w:num w:numId="28">
     <w:abstractNumId w:val="12"/>
   </w:num>
-  <w:num w:numId="29" w16cid:durableId="2145810771">
+  <w:num w:numId="29">
     <w:abstractNumId w:val="3"/>
   </w:num>
-  <w:num w:numId="30" w16cid:durableId="1826625428">
+  <w:num w:numId="30">
     <w:abstractNumId w:val="3"/>
   </w:num>
 </w:numbering>
 </file>
 
 <file path=word/styles.xml><?xml version="1.0" encoding="utf-8"?>
-<w:styles xmlns:mc="http://schemas.openxmlformats.org/markup-compatibility/2006" xmlns:r="http://schemas.openxmlformats.org/officeDocument/2006/relationships" xmlns:w="http://schemas.openxmlformats.org/wordprocessingml/2006/main" xmlns:w14="http://schemas.microsoft.com/office/word/2010/wordml" xmlns:w15="http://schemas.microsoft.com/office/word/2012/wordml" xmlns:w16cex="http://schemas.microsoft.com/office/word/2018/wordml/cex" xmlns:w16cid="http://schemas.microsoft.com/office/word/2016/wordml/cid" xmlns:w16="http://schemas.microsoft.com/office/word/2018/wordml" xmlns:w16du="http://schemas.microsoft.com/office/word/2023/wordml/word16du" xmlns:w16sdtdh="http://schemas.microsoft.com/office/word/2020/wordml/sdtdatahash" xmlns:w16sdtfl="http://schemas.microsoft.com/office/word/2024/wordml/sdtformatlock" xmlns:w16se="http://schemas.microsoft.com/office/word/2015/wordml/symex" mc:Ignorable="w14 w15 w16se w16cid w16 w16cex w16sdtdh w16sdtfl w16du">
+<w:styles xmlns:mc="http://schemas.openxmlformats.org/markup-compatibility/2006" xmlns:r="http://schemas.openxmlformats.org/officeDocument/2006/relationships" xmlns:w="http://schemas.openxmlformats.org/wordprocessingml/2006/main" xmlns:w14="http://schemas.microsoft.com/office/word/2010/wordml" xmlns:w15="http://schemas.microsoft.com/office/word/2012/wordml" xmlns:w16cex="http://schemas.microsoft.com/office/word/2018/wordml/cex" xmlns:w16cid="http://schemas.microsoft.com/office/word/2016/wordml/cid" xmlns:w16="http://schemas.microsoft.com/office/word/2018/wordml" xmlns:w16se="http://schemas.microsoft.com/office/word/2015/wordml/symex" mc:Ignorable="w14 w15 w16se w16cid w16 w16cex">
   <w:docDefaults>
     <w:rPrDefault>
       <w:rPr>
@@ -31539,6 +32076,7 @@
   <w:style w:type="character" w:default="1" w:styleId="Fuentedeprrafopredeter">
     <w:name w:val="Default Paragraph Font"/>
     <w:uiPriority w:val="1"/>
+    <w:semiHidden/>
     <w:unhideWhenUsed/>
   </w:style>
   <w:style w:type="table" w:default="1" w:styleId="Tablanormal">

</xml_diff>